<commit_message>
scd motion-brief: complete transcription of FILED-EXAMPLE-motion-brief (fb-w0vj.1)
fb diff --content: G0 PASS (7 pages); G2 residuals template-driven only.
</commit_message>
<xml_diff>
--- a/courts/fourth-circuit/south-carolina/federal/district/motion-brief/usage/OUTPUT-motion-brief.docx
+++ b/courts/fourth-circuit/south-carolina/federal/district/motion-brief/usage/OUTPUT-motion-brief.docx
@@ -6,6 +6,18 @@
       <w:pPr>
         <w:pStyle w:val="CourtHeading"/>
       </w:pPr>
+      <w:r>
+        <w:t xml:space="preserve">IN</w:t>
+      </w:r>
+      <w:r>
+        <w:t xml:space="preserve"> </w:t>
+      </w:r>
+      <w:r>
+        <w:t xml:space="preserve">THE</w:t>
+      </w:r>
+      <w:r>
+        <w:t xml:space="preserve"> </w:t>
+      </w:r>
       <w:r>
         <w:t xml:space="preserve">UNITED</w:t>
       </w:r>
@@ -142,28 +154,13 @@
               <w:t xml:space="preserve"> </w:t>
             </w:r>
             <w:r>
-              <w:rPr>
-                <w:i/>
-                <w:iCs/>
-              </w:rPr>
               <w:t xml:space="preserve">ex</w:t>
             </w:r>
             <w:r>
-              <w:rPr>
-                <w:i/>
-                <w:iCs/>
-              </w:rPr>
-              <w:t xml:space="preserve"> </w:t>
-            </w:r>
-            <w:r>
-              <w:rPr>
-                <w:i/>
-                <w:iCs/>
-              </w:rPr>
-              <w:t xml:space="preserve">rel.</w:t>
-            </w:r>
-            <w:r>
-              <w:t xml:space="preserve">,</w:t>
+              <w:t xml:space="preserve"> </w:t>
+            </w:r>
+            <w:r>
+              <w:t xml:space="preserve">rel.,</w:t>
             </w:r>
           </w:p>
           <w:p>
@@ -430,14 +427,15 @@
         <w:t xml:space="preserve">, 525 F.3d 370, 379 (4th Cir. 2008)).</w:t>
       </w:r>
     </w:p>
-    <w:bookmarkStart w:id="21" w:name="introduction"/>
     <w:p>
       <w:pPr>
         <w:pStyle w:val="Heading2"/>
       </w:pPr>
+      <w:bookmarkStart w:id="9" w:name="_introduction"/>
       <w:r>
         <w:t xml:space="preserve">INTRODUCTION</w:t>
       </w:r>
+      <w:bookmarkEnd w:id="9"/>
     </w:p>
     <w:p>
       <w:pPr>
@@ -447,13 +445,10 @@
         <w:t xml:space="preserve">Plaintiff John Cobb (“Plaintiff”)</w:t>
       </w:r>
       <w:r>
-        <w:t xml:space="preserve"> </w:t>
-      </w:r>
-      <w:r>
         <w:rPr>
           <w:rStyle w:val="FootnoteReference"/>
         </w:rPr>
-        <w:footnoteReference w:id="20"/>
+        <w:footnoteReference w:id="10"/>
       </w:r>
       <w:r>
         <w:t xml:space="preserve"> </w:t>
@@ -483,24 +478,25 @@
         <w:t xml:space="preserve">, 912 F.3d 190, 197 (4th Cir. 2018). In fact, the Amended Complaint fails to even allege the submission of a specific false or fraudulent claim that resulted in the government’s payment of money to the District.</w:t>
       </w:r>
     </w:p>
-    <w:bookmarkEnd w:id="21"/>
-    <w:bookmarkStart w:id="24" w:name="legal-standard"/>
     <w:p>
       <w:pPr>
         <w:pStyle w:val="Heading2"/>
       </w:pPr>
+      <w:bookmarkStart w:id="11" w:name="_f71bb8ee81b7f5e1fea0089ad4ffa65b0be4956"/>
       <w:r>
         <w:t xml:space="preserve">LEGAL STANDARD</w:t>
       </w:r>
-    </w:p>
-    <w:bookmarkStart w:id="22" w:name="i.-federal-rule-of-civil-procedure-12b6"/>
+      <w:bookmarkEnd w:id="11"/>
+    </w:p>
     <w:p>
       <w:pPr>
         <w:pStyle w:val="Heading3"/>
       </w:pPr>
+      <w:bookmarkStart w:id="12" w:name="_eac454c5eccf9632d130cdbdeadb4581c1af105"/>
       <w:r>
         <w:t xml:space="preserve">I. Federal Rule of Civil Procedure 12(b)(6)</w:t>
       </w:r>
+      <w:bookmarkEnd w:id="12"/>
     </w:p>
     <w:p>
       <w:pPr>
@@ -559,7 +555,7 @@
         <w:t xml:space="preserve">Erickson v. Pardus</w:t>
       </w:r>
       <w:r>
-        <w:t xml:space="preserve">, 551 U.S. 89, 94 (2007). However, “when the allegations in a complaint, however true, could not raise a claim of entitlement to relief, this basic deficiency should . . . be exposed at the point of minimum expenditure of time and money by the parties and the court.”</w:t>
+        <w:t xml:space="preserve">, 551 U.S. 89, 94 (2007). However, “when the allegations in a complaint, however true, could not raise a claim of entitlement to relief, this basic deficiency should . . . be exposed at the point of minimum expenditure of time and money by the parties and the court.</w:t>
       </w:r>
       <w:r>
         <w:t xml:space="preserve"> </w:t>
@@ -588,22 +584,38 @@
         <w:t xml:space="preserve">, 707 F.3d 451, 454 (4th Cir. 2013) (citation omitted).</w:t>
       </w:r>
     </w:p>
-    <w:bookmarkEnd w:id="22"/>
-    <w:bookmarkStart w:id="23" w:name="ii.-federal-rule-of-civil-procedure-9b"/>
     <w:p>
       <w:pPr>
         <w:pStyle w:val="Heading3"/>
       </w:pPr>
+      <w:bookmarkStart w:id="13" w:name="_6ff2019f286a62f340c45d7096331e0b5c0eaee"/>
       <w:r>
         <w:t xml:space="preserve">II. Federal Rule of Civil Procedure 9(b)</w:t>
       </w:r>
+      <w:bookmarkEnd w:id="13"/>
     </w:p>
     <w:p>
       <w:pPr>
         <w:pStyle w:val="FirstParagraph"/>
       </w:pPr>
       <w:r>
-        <w:t xml:space="preserve">Federal Rule of Civil Procedure 9 governs the pleading of special matters and subsection (b) mandates that when alleging fraud, a party “must state with particularity the circumstances constituting fraud or mistake.” Fed. R. Civ. P. 9(b). In addition to meeting the plausibility standard of Iqbal, fraud claims under the FCA must be pleaded with particularity pursuant to Rule 9(b).</w:t>
+        <w:t xml:space="preserve">Federal Rule of Civil Procedure 9 governs the pleading of special matters and subsection (b) mandates that when alleging fraud, a party “must state with particularity the circumstances constituting fraud or mistake.” Fed. R. Civ. P. 9(b). In addition to meeting the plausibility standard of</w:t>
+      </w:r>
+      <w:r>
+        <w:t xml:space="preserve"> </w:t>
+      </w:r>
+      <w:r>
+        <w:rPr>
+          <w:i/>
+          <w:iCs/>
+        </w:rPr>
+        <w:t xml:space="preserve">Iqbal,</w:t>
+      </w:r>
+      <w:r>
+        <w:t xml:space="preserve"> </w:t>
+      </w:r>
+      <w:r>
+        <w:t xml:space="preserve">fraud claims under the FCA must be pleaded with particularity pursuant to Rule 9(b).</w:t>
       </w:r>
       <w:r>
         <w:t xml:space="preserve"> </w:t>
@@ -702,32 +714,45 @@
         <w:t xml:space="preserve">, 176 F.3d 776, 783–85 (4th Cir. 1999)).</w:t>
       </w:r>
     </w:p>
-    <w:bookmarkEnd w:id="23"/>
-    <w:bookmarkEnd w:id="24"/>
-    <w:bookmarkStart w:id="26" w:name="argument"/>
     <w:p>
       <w:pPr>
         <w:pStyle w:val="Heading2"/>
       </w:pPr>
+      <w:bookmarkStart w:id="14" w:name="_argument"/>
       <w:r>
         <w:t xml:space="preserve">ARGUMENT</w:t>
       </w:r>
-    </w:p>
-    <w:bookmarkStart w:id="25" w:name="X53386debe69cb6d5e8f57916de7ddfdf9eecc86"/>
+      <w:bookmarkEnd w:id="14"/>
+    </w:p>
     <w:p>
       <w:pPr>
         <w:pStyle w:val="Heading3"/>
       </w:pPr>
+      <w:bookmarkStart w:id="15" w:name="_53386debe69cb6d5e8f57916de7ddfdf9eecc86"/>
       <w:r>
         <w:t xml:space="preserve">I. Plaintiff Fails to Sufficiently Plead a Violation of the False Claims Act.</w:t>
       </w:r>
+      <w:bookmarkEnd w:id="15"/>
     </w:p>
     <w:p>
       <w:pPr>
         <w:pStyle w:val="FirstParagraph"/>
       </w:pPr>
       <w:r>
-        <w:t xml:space="preserve">The FCA is an anti-fraud statute that imposes liability for those who make false statements and submit false claims to the Government. 31 U.S.C. § 3729(a)(1). “A false statement is actionable under the Act only if it constitutes a ‘false or fraudulent claim.’”</w:t>
+        <w:t xml:space="preserve">The FCA is an anti-fraud statute that imposes liability for those who make false statements and submit false claims to the Government. 31 U.S.C. § 3729(a)(1). “A false statement is actionable under the Act only if it constitutes a ‘false or fraudulent</w:t>
+      </w:r>
+      <w:r>
+        <w:t xml:space="preserve"> </w:t>
+      </w:r>
+      <w:r>
+        <w:rPr>
+          <w:i/>
+          <w:iCs/>
+        </w:rPr>
+        <w:t xml:space="preserve">claim.</w:t>
+      </w:r>
+      <w:r>
+        <w:t xml:space="preserve">’”</w:t>
       </w:r>
       <w:r>
         <w:t xml:space="preserve"> </w:t>
@@ -929,7 +954,22 @@
         <w:t xml:space="preserve">Id.</w:t>
       </w:r>
       <w:r>
-        <w:t xml:space="preserve">) Additionally, not only does Plaintiff fail to allege that the purportedly false claims caused the government to pay money, but he also concedes that the District’s proposal was denied. (</w:t>
+        <w:t xml:space="preserve">) Additionally, not only does Plaintiff fail to allege that the purportedly false claims caused the government to pay money, but he also concedes that the District’s proposal was</w:t>
+      </w:r>
+      <w:r>
+        <w:t xml:space="preserve"> </w:t>
+      </w:r>
+      <w:r>
+        <w:rPr>
+          <w:b/>
+          <w:bCs/>
+          <w:i/>
+          <w:iCs/>
+        </w:rPr>
+        <w:t xml:space="preserve">denied</w:t>
+      </w:r>
+      <w:r>
+        <w:t xml:space="preserve">. (</w:t>
       </w:r>
       <w:r>
         <w:rPr>
@@ -957,10 +997,10 @@
           <w:i/>
           <w:iCs/>
         </w:rPr>
-        <w:t xml:space="preserve">United States v. Savannah River Nuclear Sols., LLC</w:t>
-      </w:r>
-      <w:r>
-        <w:t xml:space="preserve">, 2016 WL 7104823, at *9 (D.S.C. Dec. 6, 2016) (quoting</w:t>
+        <w:t xml:space="preserve">United States v. Savannah River Nuclear Sols.</w:t>
+      </w:r>
+      <w:r>
+        <w:t xml:space="preserve">, LLC, 2016 WL 7104823, at *9 (D.S.C. Dec. 6, 2016) (quoting</w:t>
       </w:r>
       <w:r>
         <w:t xml:space="preserve"> </w:t>
@@ -1010,16 +1050,15 @@
         <w:t xml:space="preserve">The Amended Complaint fails to allege the presentment of a specific claim, let alone a false claim, that was material and caused the federal government to pay funds to the District. The Amended Complaint should be dismissed.</w:t>
       </w:r>
     </w:p>
-    <w:bookmarkEnd w:id="25"/>
-    <w:bookmarkEnd w:id="26"/>
-    <w:bookmarkStart w:id="27" w:name="conclusion"/>
     <w:p>
       <w:pPr>
         <w:pStyle w:val="Heading2"/>
       </w:pPr>
+      <w:bookmarkStart w:id="16" w:name="_conclusion"/>
       <w:r>
         <w:t xml:space="preserve">CONCLUSION</w:t>
       </w:r>
+      <w:bookmarkEnd w:id="16"/>
     </w:p>
     <w:p>
       <w:pPr>
@@ -1436,14 +1475,13 @@
         </w:tc>
       </w:tr>
     </w:tbl>
-    <w:bookmarkEnd w:id="27"/>
     <w:sectPr>
-      <w:footerReference r:id="rId9" w:type="default"/>
+      <w:footerReference w:type="default" r:id="rIdFooter1"/>
       <w:footnotePr>
         <w:numRestart w:val="eachSect"/>
       </w:footnotePr>
-      <w:pgSz w:h="15840" w:w="12240"/>
-      <w:pgMar w:bottom="1440" w:footer="720" w:gutter="0" w:header="720" w:left="1440" w:right="1440" w:top="1440"/>
+      <w:pgSz w:w="12240" w:h="15840"/>
+      <w:pgMar w:top="1440" w:right="1440" w:bottom="1440" w:left="1440" w:header="720" w:footer="720" w:gutter="0"/>
       <w:cols w:space="720"/>
     </w:sectPr>
   </w:body>
@@ -1495,7 +1533,7 @@
       </w:r>
     </w:p>
   </w:footnote>
-  <w:footnote w:id="20">
+  <w:footnote w:id="10">
     <w:p>
       <w:pPr>
         <w:pStyle w:val="FootnoteText"/>
@@ -1606,10 +1644,10 @@
   <w:docDefaults>
     <w:rPrDefault>
       <w:rPr>
-        <w:rFonts w:ascii="Times New Roman" w:cs="Times New Roman" w:eastAsia="Times New Roman" w:hAnsi="Times New Roman"/>
+        <w:rFonts w:ascii="Times New Roman" w:eastAsia="Times New Roman" w:hAnsi="Times New Roman" w:cs="Times New Roman"/>
         <w:sz w:val="24"/>
         <w:szCs w:val="24"/>
-        <w:lang w:bidi="ar-SA" w:eastAsia="en-US" w:val="en-US"/>
+        <w:lang w:val="en-US" w:eastAsia="en-US" w:bidi="ar-SA"/>
       </w:rPr>
     </w:rPrDefault>
     <w:pPrDefault>
@@ -1618,43 +1656,43 @@
       </w:pPr>
     </w:pPrDefault>
   </w:docDefaults>
-  <w:latentStyles w:count="276" w:defLockedState="0" w:defQFormat="0" w:defSemiHidden="0" w:defUIPriority="0" w:defUnhideWhenUsed="0"/>
-  <w:style w:default="1" w:styleId="Normal" w:type="paragraph">
+  <w:latentStyles w:defLockedState="0" w:defUIPriority="0" w:defSemiHidden="0" w:defUnhideWhenUsed="0" w:defQFormat="0" w:count="276"/>
+  <w:style w:type="paragraph" w:default="1" w:styleId="Normal">
     <w:name w:val="Normal"/>
     <w:qFormat/>
     <w:pPr>
       <w:widowControl/>
     </w:pPr>
   </w:style>
-  <w:style w:styleId="BodyText" w:type="paragraph">
+  <w:style w:type="paragraph" w:styleId="BodyText">
     <w:name w:val="Body Text"/>
     <w:basedOn w:val="Normal"/>
     <w:link w:val="BodyTextChar"/>
     <w:qFormat/>
     <w:pPr>
-      <w:spacing w:after="0" w:before="0" w:line="480" w:lineRule="auto"/>
+      <w:spacing w:before="0" w:after="0" w:line="480" w:lineRule="auto"/>
       <w:ind w:firstLine="720"/>
     </w:pPr>
   </w:style>
-  <w:style w:customStyle="1" w:styleId="FirstParagraph" w:type="paragraph">
+  <w:style w:type="paragraph" w:customStyle="1" w:styleId="FirstParagraph">
     <w:name w:val="First Paragraph"/>
     <w:basedOn w:val="BodyText"/>
     <w:next w:val="BodyText"/>
     <w:qFormat/>
     <w:pPr>
-      <w:spacing w:after="0" w:before="0" w:line="480" w:lineRule="auto"/>
+      <w:spacing w:before="0" w:after="0" w:line="480" w:lineRule="auto"/>
       <w:ind w:firstLine="720"/>
     </w:pPr>
   </w:style>
-  <w:style w:customStyle="1" w:styleId="Compact" w:type="paragraph">
+  <w:style w:type="paragraph" w:customStyle="1" w:styleId="Compact">
     <w:name w:val="Compact"/>
     <w:basedOn w:val="Normal"/>
     <w:qFormat/>
     <w:pPr>
-      <w:spacing w:after="0" w:before="0" w:line="240" w:lineRule="auto"/>
-    </w:pPr>
-  </w:style>
-  <w:style w:styleId="Title" w:type="paragraph">
+      <w:spacing w:before="0" w:after="0" w:line="240" w:lineRule="auto"/>
+    </w:pPr>
+  </w:style>
+  <w:style w:type="paragraph" w:styleId="Title">
     <w:name w:val="Title"/>
     <w:basedOn w:val="Normal"/>
     <w:next w:val="BodyText"/>
@@ -1668,24 +1706,24 @@
       <w:jc w:val="center"/>
     </w:pPr>
     <w:rPr>
-      <w:rFonts w:asciiTheme="majorHAnsi" w:cstheme="majorBidi" w:eastAsiaTheme="majorEastAsia" w:hAnsiTheme="majorHAnsi"/>
+      <w:rFonts w:asciiTheme="majorHAnsi" w:eastAsiaTheme="majorEastAsia" w:hAnsiTheme="majorHAnsi" w:cstheme="majorBidi"/>
       <w:sz w:val="56"/>
       <w:szCs w:val="56"/>
     </w:rPr>
   </w:style>
-  <w:style w:customStyle="1" w:styleId="TitleChar" w:type="character">
+  <w:style w:type="character" w:customStyle="1" w:styleId="TitleChar">
     <w:name w:val="Title Char"/>
     <w:basedOn w:val="DefaultParagraphFont"/>
     <w:link w:val="Title"/>
     <w:uiPriority w:val="10"/>
     <w:rsid w:val="00A10FD9"/>
     <w:rPr>
-      <w:rFonts w:asciiTheme="majorHAnsi" w:cstheme="majorBidi" w:eastAsiaTheme="majorEastAsia" w:hAnsiTheme="majorHAnsi"/>
+      <w:rFonts w:asciiTheme="majorHAnsi" w:eastAsiaTheme="majorEastAsia" w:hAnsiTheme="majorHAnsi" w:cstheme="majorBidi"/>
       <w:sz w:val="56"/>
       <w:szCs w:val="56"/>
     </w:rPr>
   </w:style>
-  <w:style w:styleId="Subtitle" w:type="paragraph">
+  <w:style w:type="paragraph" w:styleId="Subtitle">
     <w:name w:val="Subtitle"/>
     <w:basedOn w:val="Title"/>
     <w:next w:val="BodyText"/>
@@ -1699,27 +1737,27 @@
       </w:numPr>
     </w:pPr>
     <w:rPr>
-      <w:rFonts w:cstheme="majorBidi" w:eastAsiaTheme="majorEastAsia"/>
+      <w:rFonts w:eastAsiaTheme="majorEastAsia" w:cstheme="majorBidi"/>
       <w:spacing w:val="15"/>
       <w:sz w:val="28"/>
       <w:szCs w:val="28"/>
     </w:rPr>
   </w:style>
-  <w:style w:customStyle="1" w:styleId="SubtitleChar" w:type="character">
+  <w:style w:type="character" w:customStyle="1" w:styleId="SubtitleChar">
     <w:name w:val="Subtitle Char"/>
     <w:basedOn w:val="DefaultParagraphFont"/>
     <w:link w:val="Subtitle"/>
     <w:uiPriority w:val="11"/>
     <w:rsid w:val="00A10FD9"/>
     <w:rPr>
-      <w:rFonts w:cstheme="majorBidi" w:eastAsiaTheme="majorEastAsia"/>
-      <w:color w:themeColor="text1" w:themeTint="A6" w:val="595959"/>
+      <w:rFonts w:eastAsiaTheme="majorEastAsia" w:cstheme="majorBidi"/>
+      <w:color w:val="595959" w:themeColor="text1" w:themeTint="A6"/>
       <w:spacing w:val="15"/>
       <w:sz w:val="28"/>
       <w:szCs w:val="28"/>
     </w:rPr>
   </w:style>
-  <w:style w:customStyle="1" w:styleId="Author" w:type="paragraph">
+  <w:style w:type="paragraph" w:customStyle="1" w:styleId="Author">
     <w:name w:val="Author"/>
     <w:basedOn w:val="Title"/>
     <w:next w:val="BodyText"/>
@@ -1733,7 +1771,7 @@
       <w:szCs w:val="24"/>
     </w:rPr>
   </w:style>
-  <w:style w:styleId="Date" w:type="paragraph">
+  <w:style w:type="paragraph" w:styleId="Date">
     <w:name w:val="Date"/>
     <w:basedOn w:val="Title"/>
     <w:next w:val="BodyText"/>
@@ -1747,7 +1785,7 @@
       <w:szCs w:val="24"/>
     </w:rPr>
   </w:style>
-  <w:style w:customStyle="1" w:styleId="AbstractTitle" w:type="paragraph">
+  <w:style w:type="paragraph" w:customStyle="1" w:styleId="AbstractTitle">
     <w:name w:val="Abstract Title"/>
     <w:basedOn w:val="Normal"/>
     <w:next w:val="Abstract"/>
@@ -1755,7 +1793,7 @@
     <w:pPr>
       <w:keepNext/>
       <w:keepLines/>
-      <w:spacing w:after="0" w:before="300"/>
+      <w:spacing w:before="300" w:after="0"/>
       <w:jc w:val="center"/>
     </w:pPr>
     <w:rPr>
@@ -1764,7 +1802,7 @@
       <w:szCs w:val="20"/>
     </w:rPr>
   </w:style>
-  <w:style w:customStyle="1" w:styleId="Abstract" w:type="paragraph">
+  <w:style w:type="paragraph" w:customStyle="1" w:styleId="Abstract">
     <w:name w:val="Abstract"/>
     <w:basedOn w:val="Normal"/>
     <w:next w:val="BodyText"/>
@@ -1772,14 +1810,14 @@
     <w:pPr>
       <w:keepNext/>
       <w:keepLines/>
-      <w:spacing w:after="300" w:before="100"/>
+      <w:spacing w:before="100" w:after="300"/>
     </w:pPr>
     <w:rPr>
       <w:sz w:val="20"/>
       <w:szCs w:val="20"/>
     </w:rPr>
   </w:style>
-  <w:style w:styleId="Bibliography" w:type="paragraph">
+  <w:style w:type="paragraph" w:styleId="Bibliography">
     <w:name w:val="Bibliography"/>
     <w:basedOn w:val="Normal"/>
     <w:next w:val="Bibliography"/>
@@ -1787,7 +1825,7 @@
     <w:pPr/>
     <w:rPr/>
   </w:style>
-  <w:style w:styleId="Heading1" w:type="paragraph">
+  <w:style w:type="paragraph" w:styleId="Heading1">
     <w:name w:val="heading 1"/>
     <w:basedOn w:val="Normal"/>
     <w:next w:val="BodyText"/>
@@ -1797,13 +1835,13 @@
     <w:pPr>
       <w:keepNext/>
       <w:keepLines/>
-      <w:spacing w:after="216" w:before="288" w:line="240" w:lineRule="auto"/>
+      <w:spacing w:before="288" w:after="216" w:line="240" w:lineRule="auto"/>
       <w:ind w:firstLine="0"/>
       <w:jc w:val="center"/>
       <w:outlineLvl w:val="0"/>
     </w:pPr>
     <w:rPr>
-      <w:rFonts w:ascii="Times New Roman" w:cs="Times New Roman" w:eastAsia="Times New Roman" w:hAnsi="Times New Roman"/>
+      <w:rFonts w:ascii="Times New Roman" w:eastAsia="Times New Roman" w:hAnsi="Times New Roman" w:cs="Times New Roman"/>
       <w:b/>
       <w:bCs/>
       <w:caps/>
@@ -1812,7 +1850,7 @@
       <w:szCs w:val="24"/>
     </w:rPr>
   </w:style>
-  <w:style w:styleId="Heading2" w:type="paragraph">
+  <w:style w:type="paragraph" w:styleId="Heading2">
     <w:name w:val="heading 2"/>
     <w:basedOn w:val="Normal"/>
     <w:next w:val="BodyText"/>
@@ -1823,13 +1861,13 @@
     <w:pPr>
       <w:keepNext/>
       <w:keepLines/>
-      <w:spacing w:after="216" w:before="288" w:line="240" w:lineRule="auto"/>
+      <w:spacing w:before="288" w:after="216" w:line="240" w:lineRule="auto"/>
       <w:ind w:firstLine="0"/>
       <w:jc w:val="center"/>
       <w:outlineLvl w:val="1"/>
     </w:pPr>
     <w:rPr>
-      <w:rFonts w:ascii="Times New Roman" w:cs="Times New Roman" w:eastAsia="Times New Roman" w:hAnsi="Times New Roman"/>
+      <w:rFonts w:ascii="Times New Roman" w:eastAsia="Times New Roman" w:hAnsi="Times New Roman" w:cs="Times New Roman"/>
       <w:b/>
       <w:bCs/>
       <w:caps/>
@@ -1838,7 +1876,7 @@
       <w:szCs w:val="24"/>
     </w:rPr>
   </w:style>
-  <w:style w:styleId="Heading3" w:type="paragraph">
+  <w:style w:type="paragraph" w:styleId="Heading3">
     <w:name w:val="heading 3"/>
     <w:basedOn w:val="Normal"/>
     <w:next w:val="BodyText"/>
@@ -1849,12 +1887,12 @@
     <w:pPr>
       <w:keepNext/>
       <w:keepLines/>
-      <w:spacing w:after="216" w:before="240" w:line="240" w:lineRule="auto"/>
+      <w:spacing w:before="240" w:after="216" w:line="240" w:lineRule="auto"/>
       <w:ind w:firstLine="0"/>
       <w:outlineLvl w:val="2"/>
     </w:pPr>
     <w:rPr>
-      <w:rFonts w:ascii="Times New Roman" w:cs="Times New Roman" w:eastAsia="Times New Roman" w:hAnsi="Times New Roman"/>
+      <w:rFonts w:ascii="Times New Roman" w:eastAsia="Times New Roman" w:hAnsi="Times New Roman" w:cs="Times New Roman"/>
       <w:b/>
       <w:bCs/>
       <w:color w:val="000000"/>
@@ -1862,7 +1900,7 @@
       <w:szCs w:val="24"/>
     </w:rPr>
   </w:style>
-  <w:style w:styleId="Heading4" w:type="paragraph">
+  <w:style w:type="paragraph" w:styleId="Heading4">
     <w:name w:val="heading 4"/>
     <w:basedOn w:val="Normal"/>
     <w:next w:val="BodyText"/>
@@ -1875,17 +1913,17 @@
     <w:pPr>
       <w:keepNext/>
       <w:keepLines/>
-      <w:spacing w:after="40" w:before="80"/>
+      <w:spacing w:before="80" w:after="40"/>
       <w:outlineLvl w:val="3"/>
     </w:pPr>
     <w:rPr>
-      <w:rFonts w:cstheme="majorBidi" w:eastAsiaTheme="majorEastAsia"/>
+      <w:rFonts w:eastAsiaTheme="majorEastAsia" w:cstheme="majorBidi"/>
       <w:i/>
       <w:iCs/>
-      <w:color w:themeColor="accent1" w:themeShade="BF" w:val="0F4761"/>
-    </w:rPr>
-  </w:style>
-  <w:style w:styleId="Heading5" w:type="paragraph">
+      <w:color w:val="0F4761" w:themeColor="accent1" w:themeShade="BF"/>
+    </w:rPr>
+  </w:style>
+  <w:style w:type="paragraph" w:styleId="Heading5">
     <w:name w:val="heading 5"/>
     <w:basedOn w:val="Normal"/>
     <w:next w:val="BodyText"/>
@@ -1898,15 +1936,15 @@
     <w:pPr>
       <w:keepNext/>
       <w:keepLines/>
-      <w:spacing w:after="40" w:before="80"/>
+      <w:spacing w:before="80" w:after="40"/>
       <w:outlineLvl w:val="4"/>
     </w:pPr>
     <w:rPr>
-      <w:rFonts w:cstheme="majorBidi" w:eastAsiaTheme="majorEastAsia"/>
-      <w:color w:themeColor="accent1" w:themeShade="BF" w:val="0F4761"/>
-    </w:rPr>
-  </w:style>
-  <w:style w:styleId="Heading6" w:type="paragraph">
+      <w:rFonts w:eastAsiaTheme="majorEastAsia" w:cstheme="majorBidi"/>
+      <w:color w:val="0F4761" w:themeColor="accent1" w:themeShade="BF"/>
+    </w:rPr>
+  </w:style>
+  <w:style w:type="paragraph" w:styleId="Heading6">
     <w:name w:val="heading 6"/>
     <w:basedOn w:val="Normal"/>
     <w:next w:val="BodyText"/>
@@ -1919,17 +1957,17 @@
     <w:pPr>
       <w:keepNext/>
       <w:keepLines/>
-      <w:spacing w:after="0" w:before="40"/>
+      <w:spacing w:before="40" w:after="0"/>
       <w:outlineLvl w:val="5"/>
     </w:pPr>
     <w:rPr>
-      <w:rFonts w:cstheme="majorBidi" w:eastAsiaTheme="majorEastAsia"/>
+      <w:rFonts w:eastAsiaTheme="majorEastAsia" w:cstheme="majorBidi"/>
       <w:i/>
       <w:iCs/>
-      <w:color w:themeColor="text1" w:themeTint="A6" w:val="595959"/>
-    </w:rPr>
-  </w:style>
-  <w:style w:styleId="Heading7" w:type="paragraph">
+      <w:color w:val="595959" w:themeColor="text1" w:themeTint="A6"/>
+    </w:rPr>
+  </w:style>
+  <w:style w:type="paragraph" w:styleId="Heading7">
     <w:name w:val="heading 7"/>
     <w:basedOn w:val="Normal"/>
     <w:next w:val="BodyText"/>
@@ -1942,15 +1980,15 @@
     <w:pPr>
       <w:keepNext/>
       <w:keepLines/>
-      <w:spacing w:after="0" w:before="40"/>
+      <w:spacing w:before="40" w:after="0"/>
       <w:outlineLvl w:val="6"/>
     </w:pPr>
     <w:rPr>
-      <w:rFonts w:cstheme="majorBidi" w:eastAsiaTheme="majorEastAsia"/>
-      <w:color w:themeColor="text1" w:themeTint="A6" w:val="595959"/>
-    </w:rPr>
-  </w:style>
-  <w:style w:styleId="Heading8" w:type="paragraph">
+      <w:rFonts w:eastAsiaTheme="majorEastAsia" w:cstheme="majorBidi"/>
+      <w:color w:val="595959" w:themeColor="text1" w:themeTint="A6"/>
+    </w:rPr>
+  </w:style>
+  <w:style w:type="paragraph" w:styleId="Heading8">
     <w:name w:val="heading 8"/>
     <w:basedOn w:val="Normal"/>
     <w:next w:val="BodyText"/>
@@ -1967,13 +2005,13 @@
       <w:outlineLvl w:val="7"/>
     </w:pPr>
     <w:rPr>
-      <w:rFonts w:cstheme="majorBidi" w:eastAsiaTheme="majorEastAsia"/>
+      <w:rFonts w:eastAsiaTheme="majorEastAsia" w:cstheme="majorBidi"/>
       <w:i/>
       <w:iCs/>
-      <w:color w:themeColor="text1" w:themeTint="D8" w:val="272727"/>
-    </w:rPr>
-  </w:style>
-  <w:style w:styleId="Heading9" w:type="paragraph">
+      <w:color w:val="272727" w:themeColor="text1" w:themeTint="D8"/>
+    </w:rPr>
+  </w:style>
+  <w:style w:type="paragraph" w:styleId="Heading9">
     <w:name w:val="heading 9"/>
     <w:basedOn w:val="Normal"/>
     <w:next w:val="BodyText"/>
@@ -1990,24 +2028,24 @@
       <w:outlineLvl w:val="8"/>
     </w:pPr>
     <w:rPr>
-      <w:rFonts w:cstheme="majorBidi" w:eastAsiaTheme="majorEastAsia"/>
-      <w:color w:themeColor="text1" w:themeTint="D8" w:val="272727"/>
-    </w:rPr>
-  </w:style>
-  <w:style w:customStyle="1" w:styleId="Heading1Char" w:type="character">
+      <w:rFonts w:eastAsiaTheme="majorEastAsia" w:cstheme="majorBidi"/>
+      <w:color w:val="272727" w:themeColor="text1" w:themeTint="D8"/>
+    </w:rPr>
+  </w:style>
+  <w:style w:type="character" w:customStyle="1" w:styleId="Heading1Char">
     <w:name w:val="Heading 1 Char"/>
     <w:basedOn w:val="DefaultParagraphFont"/>
     <w:link w:val="Heading1"/>
     <w:uiPriority w:val="9"/>
     <w:rsid w:val="00A10FD9"/>
     <w:rPr>
-      <w:rFonts w:asciiTheme="majorHAnsi" w:cstheme="majorBidi" w:eastAsiaTheme="majorEastAsia" w:hAnsiTheme="majorHAnsi"/>
-      <w:color w:themeColor="accent1" w:themeShade="BF" w:val="0F4761"/>
+      <w:rFonts w:asciiTheme="majorHAnsi" w:eastAsiaTheme="majorEastAsia" w:hAnsiTheme="majorHAnsi" w:cstheme="majorBidi"/>
+      <w:color w:val="0F4761" w:themeColor="accent1" w:themeShade="BF"/>
       <w:sz w:val="40"/>
       <w:szCs w:val="40"/>
     </w:rPr>
   </w:style>
-  <w:style w:customStyle="1" w:styleId="Heading2Char" w:type="character">
+  <w:style w:type="character" w:customStyle="1" w:styleId="Heading2Char">
     <w:name w:val="Heading 2 Char"/>
     <w:basedOn w:val="DefaultParagraphFont"/>
     <w:link w:val="Heading2"/>
@@ -2015,13 +2053,13 @@
     <w:semiHidden/>
     <w:rsid w:val="00A10FD9"/>
     <w:rPr>
-      <w:rFonts w:asciiTheme="majorHAnsi" w:cstheme="majorBidi" w:eastAsiaTheme="majorEastAsia" w:hAnsiTheme="majorHAnsi"/>
-      <w:color w:themeColor="accent1" w:themeShade="BF" w:val="0F4761"/>
+      <w:rFonts w:asciiTheme="majorHAnsi" w:eastAsiaTheme="majorEastAsia" w:hAnsiTheme="majorHAnsi" w:cstheme="majorBidi"/>
+      <w:color w:val="0F4761" w:themeColor="accent1" w:themeShade="BF"/>
       <w:sz w:val="32"/>
       <w:szCs w:val="32"/>
     </w:rPr>
   </w:style>
-  <w:style w:customStyle="1" w:styleId="Heading3Char" w:type="character">
+  <w:style w:type="character" w:customStyle="1" w:styleId="Heading3Char">
     <w:name w:val="Heading 3 Char"/>
     <w:basedOn w:val="DefaultParagraphFont"/>
     <w:link w:val="Heading3"/>
@@ -2029,13 +2067,13 @@
     <w:semiHidden/>
     <w:rsid w:val="00A10FD9"/>
     <w:rPr>
-      <w:rFonts w:cstheme="majorBidi" w:eastAsiaTheme="majorEastAsia"/>
-      <w:color w:themeColor="accent1" w:themeShade="BF" w:val="0F4761"/>
+      <w:rFonts w:eastAsiaTheme="majorEastAsia" w:cstheme="majorBidi"/>
+      <w:color w:val="0F4761" w:themeColor="accent1" w:themeShade="BF"/>
       <w:sz w:val="28"/>
       <w:szCs w:val="28"/>
     </w:rPr>
   </w:style>
-  <w:style w:customStyle="1" w:styleId="Heading4Char" w:type="character">
+  <w:style w:type="character" w:customStyle="1" w:styleId="Heading4Char">
     <w:name w:val="Heading 4 Char"/>
     <w:basedOn w:val="DefaultParagraphFont"/>
     <w:link w:val="Heading4"/>
@@ -2043,13 +2081,13 @@
     <w:semiHidden/>
     <w:rsid w:val="00A10FD9"/>
     <w:rPr>
-      <w:rFonts w:cstheme="majorBidi" w:eastAsiaTheme="majorEastAsia"/>
+      <w:rFonts w:eastAsiaTheme="majorEastAsia" w:cstheme="majorBidi"/>
       <w:i/>
       <w:iCs/>
-      <w:color w:themeColor="accent1" w:themeShade="BF" w:val="0F4761"/>
-    </w:rPr>
-  </w:style>
-  <w:style w:customStyle="1" w:styleId="Heading5Char" w:type="character">
+      <w:color w:val="0F4761" w:themeColor="accent1" w:themeShade="BF"/>
+    </w:rPr>
+  </w:style>
+  <w:style w:type="character" w:customStyle="1" w:styleId="Heading5Char">
     <w:name w:val="Heading 5 Char"/>
     <w:basedOn w:val="DefaultParagraphFont"/>
     <w:link w:val="Heading5"/>
@@ -2057,11 +2095,11 @@
     <w:semiHidden/>
     <w:rsid w:val="00A10FD9"/>
     <w:rPr>
-      <w:rFonts w:cstheme="majorBidi" w:eastAsiaTheme="majorEastAsia"/>
-      <w:color w:themeColor="accent1" w:themeShade="BF" w:val="0F4761"/>
-    </w:rPr>
-  </w:style>
-  <w:style w:customStyle="1" w:styleId="Heading6Char" w:type="character">
+      <w:rFonts w:eastAsiaTheme="majorEastAsia" w:cstheme="majorBidi"/>
+      <w:color w:val="0F4761" w:themeColor="accent1" w:themeShade="BF"/>
+    </w:rPr>
+  </w:style>
+  <w:style w:type="character" w:customStyle="1" w:styleId="Heading6Char">
     <w:name w:val="Heading 6 Char"/>
     <w:basedOn w:val="DefaultParagraphFont"/>
     <w:link w:val="Heading6"/>
@@ -2069,13 +2107,13 @@
     <w:semiHidden/>
     <w:rsid w:val="00A10FD9"/>
     <w:rPr>
-      <w:rFonts w:cstheme="majorBidi" w:eastAsiaTheme="majorEastAsia"/>
+      <w:rFonts w:eastAsiaTheme="majorEastAsia" w:cstheme="majorBidi"/>
       <w:i/>
       <w:iCs/>
-      <w:color w:themeColor="text1" w:themeTint="A6" w:val="595959"/>
-    </w:rPr>
-  </w:style>
-  <w:style w:customStyle="1" w:styleId="Heading7Char" w:type="character">
+      <w:color w:val="595959" w:themeColor="text1" w:themeTint="A6"/>
+    </w:rPr>
+  </w:style>
+  <w:style w:type="character" w:customStyle="1" w:styleId="Heading7Char">
     <w:name w:val="Heading 7 Char"/>
     <w:basedOn w:val="DefaultParagraphFont"/>
     <w:link w:val="Heading7"/>
@@ -2083,11 +2121,11 @@
     <w:semiHidden/>
     <w:rsid w:val="00A10FD9"/>
     <w:rPr>
-      <w:rFonts w:cstheme="majorBidi" w:eastAsiaTheme="majorEastAsia"/>
-      <w:color w:themeColor="text1" w:themeTint="A6" w:val="595959"/>
-    </w:rPr>
-  </w:style>
-  <w:style w:customStyle="1" w:styleId="Heading8Char" w:type="character">
+      <w:rFonts w:eastAsiaTheme="majorEastAsia" w:cstheme="majorBidi"/>
+      <w:color w:val="595959" w:themeColor="text1" w:themeTint="A6"/>
+    </w:rPr>
+  </w:style>
+  <w:style w:type="character" w:customStyle="1" w:styleId="Heading8Char">
     <w:name w:val="Heading 8 Char"/>
     <w:basedOn w:val="DefaultParagraphFont"/>
     <w:link w:val="Heading8"/>
@@ -2095,13 +2133,13 @@
     <w:semiHidden/>
     <w:rsid w:val="00A10FD9"/>
     <w:rPr>
-      <w:rFonts w:cstheme="majorBidi" w:eastAsiaTheme="majorEastAsia"/>
+      <w:rFonts w:eastAsiaTheme="majorEastAsia" w:cstheme="majorBidi"/>
       <w:i/>
       <w:iCs/>
-      <w:color w:themeColor="text1" w:themeTint="D8" w:val="272727"/>
-    </w:rPr>
-  </w:style>
-  <w:style w:customStyle="1" w:styleId="Heading9Char" w:type="character">
+      <w:color w:val="272727" w:themeColor="text1" w:themeTint="D8"/>
+    </w:rPr>
+  </w:style>
+  <w:style w:type="character" w:customStyle="1" w:styleId="Heading9Char">
     <w:name w:val="Heading 9 Char"/>
     <w:basedOn w:val="DefaultParagraphFont"/>
     <w:link w:val="Heading9"/>
@@ -2109,11 +2147,11 @@
     <w:semiHidden/>
     <w:rsid w:val="00A10FD9"/>
     <w:rPr>
-      <w:rFonts w:cstheme="majorBidi" w:eastAsiaTheme="majorEastAsia"/>
-      <w:color w:themeColor="text1" w:themeTint="D8" w:val="272727"/>
-    </w:rPr>
-  </w:style>
-  <w:style w:styleId="BlockText" w:type="paragraph">
+      <w:rFonts w:eastAsiaTheme="majorEastAsia" w:cstheme="majorBidi"/>
+      <w:color w:val="272727" w:themeColor="text1" w:themeTint="D8"/>
+    </w:rPr>
+  </w:style>
+  <w:style w:type="paragraph" w:styleId="BlockText">
     <w:name w:val="Block Text"/>
     <w:basedOn w:val="Normal"/>
     <w:next w:val="BodyText"/>
@@ -2121,7 +2159,7 @@
     <w:unhideWhenUsed/>
     <w:qFormat/>
     <w:pPr>
-      <w:spacing w:after="240" w:before="0" w:line="240" w:lineRule="auto"/>
+      <w:spacing w:before="0" w:after="240" w:line="240" w:lineRule="auto"/>
       <w:ind w:firstLine="0" w:left="720" w:right="720"/>
     </w:pPr>
     <w:rPr>
@@ -2129,14 +2167,14 @@
       <w:szCs w:val="24"/>
     </w:rPr>
   </w:style>
-  <w:style w:styleId="FootnoteText" w:type="paragraph">
+  <w:style w:type="paragraph" w:styleId="FootnoteText">
     <w:name w:val="footnote text"/>
     <w:basedOn w:val="Normal"/>
     <w:uiPriority w:val="9"/>
     <w:unhideWhenUsed/>
     <w:qFormat/>
     <w:pPr>
-      <w:spacing w:after="120" w:before="0" w:line="240" w:lineRule="auto"/>
+      <w:spacing w:before="0" w:after="120" w:line="240" w:lineRule="auto"/>
       <w:ind w:firstLine="0"/>
     </w:pPr>
     <w:rPr>
@@ -2144,7 +2182,7 @@
       <w:szCs w:val="24"/>
     </w:rPr>
   </w:style>
-  <w:style w:styleId="FootnoteBlockText" w:type="paragraph">
+  <w:style w:type="paragraph" w:styleId="FootnoteBlockText">
     <w:name w:val="Footnote Block Text"/>
     <w:basedOn w:val="FootnoteText"/>
     <w:next w:val="FootnoteText"/>
@@ -2152,34 +2190,34 @@
     <w:unhideWhenUsed/>
     <w:qFormat/>
     <w:pPr>
-      <w:spacing w:after="100" w:before="100"/>
+      <w:spacing w:before="100" w:after="100"/>
       <w:ind w:firstLine="0" w:left="480" w:right="480"/>
     </w:pPr>
   </w:style>
-  <w:style w:default="1" w:styleId="DefaultParagraphFont" w:type="character">
+  <w:style w:type="character" w:default="1" w:styleId="DefaultParagraphFont">
     <w:name w:val="Default Paragraph Font"/>
     <w:semiHidden/>
     <w:unhideWhenUsed/>
   </w:style>
-  <w:style w:default="1" w:styleId="Table" w:type="table">
+  <w:style w:type="table" w:default="1" w:styleId="Table">
     <w:name w:val="Table"/>
     <w:basedOn w:val="TableNormal"/>
     <w:semiHidden/>
     <w:unhideWhenUsed/>
     <w:qFormat/>
     <w:tblPr>
-      <w:tblInd w:type="dxa" w:w="0"/>
+      <w:tblInd w:w="0" w:type="dxa"/>
       <w:tblCellMar>
-        <w:top w:type="dxa" w:w="0"/>
-        <w:left w:type="dxa" w:w="108"/>
-        <w:bottom w:type="dxa" w:w="0"/>
-        <w:right w:type="dxa" w:w="108"/>
+        <w:top w:w="0" w:type="dxa"/>
+        <w:left w:w="108" w:type="dxa"/>
+        <w:bottom w:w="0" w:type="dxa"/>
+        <w:right w:w="108" w:type="dxa"/>
       </w:tblCellMar>
     </w:tblPr>
     <w:tblStylePr w:type="firstRow">
       <w:tblPr>
         <w:jc w:val="left"/>
-        <w:tblInd w:type="dxa" w:w="0"/>
+        <w:tblInd w:w="0" w:type="dxa"/>
       </w:tblPr>
       <w:trPr>
         <w:jc w:val="left"/>
@@ -2192,7 +2230,7 @@
       </w:tcPr>
     </w:tblStylePr>
   </w:style>
-  <w:style w:customStyle="1" w:styleId="DefinitionTerm" w:type="paragraph">
+  <w:style w:type="paragraph" w:customStyle="1" w:styleId="DefinitionTerm">
     <w:name w:val="Definition Term"/>
     <w:basedOn w:val="Normal"/>
     <w:next w:val="Definition"/>
@@ -2205,49 +2243,49 @@
       <w:b/>
     </w:rPr>
   </w:style>
-  <w:style w:customStyle="1" w:styleId="Definition" w:type="paragraph">
+  <w:style w:type="paragraph" w:customStyle="1" w:styleId="Definition">
     <w:name w:val="Definition"/>
     <w:basedOn w:val="Normal"/>
   </w:style>
-  <w:style w:styleId="Caption" w:type="paragraph">
+  <w:style w:type="paragraph" w:styleId="Caption">
     <w:name w:val="Caption"/>
     <w:basedOn w:val="Normal"/>
     <w:link w:val="BodyTextChar"/>
     <w:pPr>
-      <w:spacing w:after="120" w:before="0"/>
+      <w:spacing w:before="0" w:after="120"/>
     </w:pPr>
     <w:rPr>
       <w:i/>
     </w:rPr>
   </w:style>
-  <w:style w:customStyle="1" w:styleId="TableCaption" w:type="paragraph">
+  <w:style w:type="paragraph" w:customStyle="1" w:styleId="TableCaption">
     <w:name w:val="Table Caption"/>
     <w:basedOn w:val="Caption"/>
     <w:pPr>
       <w:keepNext/>
     </w:pPr>
   </w:style>
-  <w:style w:customStyle="1" w:styleId="ImageCaption" w:type="paragraph">
+  <w:style w:type="paragraph" w:customStyle="1" w:styleId="ImageCaption">
     <w:name w:val="Image Caption"/>
     <w:basedOn w:val="Caption"/>
   </w:style>
-  <w:style w:customStyle="1" w:styleId="Figure" w:type="paragraph">
+  <w:style w:type="paragraph" w:customStyle="1" w:styleId="Figure">
     <w:name w:val="Figure"/>
     <w:basedOn w:val="Normal"/>
   </w:style>
-  <w:style w:customStyle="1" w:styleId="CaptionedFigure" w:type="paragraph">
+  <w:style w:type="paragraph" w:customStyle="1" w:styleId="CaptionedFigure">
     <w:name w:val="Captioned Figure"/>
     <w:basedOn w:val="Figure"/>
     <w:pPr>
       <w:keepNext/>
     </w:pPr>
   </w:style>
-  <w:style w:customStyle="1" w:styleId="BodyTextChar" w:type="character">
+  <w:style w:type="character" w:customStyle="1" w:styleId="BodyTextChar">
     <w:name w:val="Body Text Char"/>
     <w:basedOn w:val="DefaultParagraphFont"/>
     <w:link w:val="BodyText"/>
   </w:style>
-  <w:style w:customStyle="1" w:styleId="VerbatimChar" w:type="character">
+  <w:style w:type="character" w:customStyle="1" w:styleId="VerbatimChar">
     <w:name w:val="Verbatim Char"/>
     <w:basedOn w:val="BodyTextChar"/>
     <w:rPr>
@@ -2255,25 +2293,25 @@
       <w:sz w:val="22"/>
     </w:rPr>
   </w:style>
-  <w:style w:customStyle="1" w:styleId="SectionNumber" w:type="character">
+  <w:style w:type="character" w:customStyle="1" w:styleId="SectionNumber">
     <w:name w:val="Section Number"/>
     <w:basedOn w:val="BodyTextChar"/>
   </w:style>
-  <w:style w:styleId="FootnoteReference" w:type="character">
+  <w:style w:type="character" w:styleId="FootnoteReference">
     <w:name w:val="Footnote Reference"/>
     <w:basedOn w:val="BodyTextChar"/>
     <w:rPr>
       <w:vertAlign w:val="superscript"/>
     </w:rPr>
   </w:style>
-  <w:style w:styleId="Hyperlink" w:type="character">
+  <w:style w:type="character" w:styleId="Hyperlink">
     <w:name w:val="Hyperlink"/>
     <w:basedOn w:val="BodyTextChar"/>
     <w:rPr>
-      <w:color w:themeColor="accent1" w:val="4F81BD"/>
-    </w:rPr>
-  </w:style>
-  <w:style w:styleId="TOCHeading" w:type="paragraph">
+      <w:color w:val="4F81BD" w:themeColor="accent1"/>
+    </w:rPr>
+  </w:style>
+  <w:style w:type="paragraph" w:styleId="TOCHeading">
     <w:name w:val="TOC Heading"/>
     <w:basedOn w:val="Heading1"/>
     <w:next w:val="BodyText"/>
@@ -2285,19 +2323,19 @@
       <w:outlineLvl w:val="9"/>
     </w:pPr>
     <w:rPr>
-      <w:rFonts w:asciiTheme="majorHAnsi" w:cstheme="majorBidi" w:eastAsiaTheme="majorEastAsia" w:hAnsiTheme="majorHAnsi"/>
+      <w:rFonts w:asciiTheme="majorHAnsi" w:eastAsiaTheme="majorEastAsia" w:hAnsiTheme="majorHAnsi" w:cstheme="majorBidi"/>
       <w:b w:val="0"/>
       <w:bCs w:val="0"/>
-      <w:color w:themeColor="accent1" w:themeShade="BF" w:val="365F91"/>
-    </w:rPr>
-  </w:style>
-  <w:style w:customStyle="1" w:styleId="CourtHeading" w:type="paragraph">
+      <w:color w:val="365F91" w:themeColor="accent1" w:themeShade="BF"/>
+    </w:rPr>
+  </w:style>
+  <w:style w:type="paragraph" w:customStyle="1" w:styleId="CourtHeading">
     <w:name w:val="Court Heading"/>
     <w:basedOn w:val="Normal"/>
     <w:qFormat/>
     <w:pPr>
       <w:keepNext/>
-      <w:spacing w:after="0" w:before="0" w:line="240" w:lineRule="auto"/>
+      <w:spacing w:before="0" w:after="0" w:line="240" w:lineRule="auto"/>
       <w:ind w:firstLine="0"/>
       <w:jc w:val="center"/>
     </w:pPr>
@@ -2307,30 +2345,30 @@
       <w:caps/>
     </w:rPr>
   </w:style>
-  <w:style w:customStyle="1" w:styleId="CourtHeadingLast" w:type="paragraph">
+  <w:style w:type="paragraph" w:customStyle="1" w:styleId="CourtHeadingLast">
     <w:name w:val="Court Heading Last"/>
     <w:basedOn w:val="CourtHeading"/>
     <w:qFormat/>
     <w:pPr>
-      <w:spacing w:after="360" w:before="0" w:line="240" w:lineRule="auto"/>
-    </w:pPr>
-  </w:style>
-  <w:style w:customStyle="1" w:styleId="CaptionText" w:type="paragraph">
+      <w:spacing w:before="0" w:after="360" w:line="240" w:lineRule="auto"/>
+    </w:pPr>
+  </w:style>
+  <w:style w:type="paragraph" w:customStyle="1" w:styleId="CaptionText">
     <w:name w:val="Caption Text"/>
     <w:basedOn w:val="Normal"/>
     <w:qFormat/>
     <w:pPr>
-      <w:spacing w:after="0" w:before="0" w:line="240" w:lineRule="auto"/>
+      <w:spacing w:before="0" w:after="0" w:line="240" w:lineRule="auto"/>
       <w:ind w:firstLine="0"/>
     </w:pPr>
   </w:style>
-  <w:style w:customStyle="1" w:styleId="DocumentTitle" w:type="paragraph">
+  <w:style w:type="paragraph" w:customStyle="1" w:styleId="DocumentTitle">
     <w:name w:val="Document Title"/>
     <w:basedOn w:val="Normal"/>
     <w:qFormat/>
     <w:pPr>
       <w:keepNext/>
-      <w:spacing w:after="165" w:before="360" w:line="240" w:lineRule="auto"/>
+      <w:spacing w:before="360" w:after="165" w:line="240" w:lineRule="auto"/>
       <w:ind w:firstLine="0"/>
       <w:jc w:val="center"/>
     </w:pPr>
@@ -2340,14 +2378,14 @@
       <w:caps/>
     </w:rPr>
   </w:style>
-  <w:style w:customStyle="1" w:styleId="SignatureText" w:type="paragraph">
+  <w:style w:type="paragraph" w:customStyle="1" w:styleId="SignatureText">
     <w:name w:val="Signature Text"/>
     <w:basedOn w:val="Normal"/>
     <w:qFormat/>
     <w:pPr>
       <w:keepNext/>
       <w:keepLines/>
-      <w:spacing w:after="0" w:before="0" w:line="240" w:lineRule="auto"/>
+      <w:spacing w:before="0" w:after="0" w:line="240" w:lineRule="auto"/>
       <w:ind w:firstLine="0"/>
     </w:pPr>
   </w:style>

</xml_diff>

<commit_message>
scd motion-brief: typst and docx on the shared cross-engine layout model; docx/make-reference.sh and reference.docx give way to docx/reference.xml (base="xengine", {font} Times New Roman, L.R. 1.05(B)); word-compat's justified 1.6em leading gives way to a 27.6 pt double-spaced pitch (Word's double of 12 pt Times, L.R. 1.05(E)) with 13.8 pt single lines for court name, caption, title, headings, quotation, footnotes and signature; footnotes at 12 pt (L.R. 1.05(C); typst set them smaller), page number in a 13.8 pt line 0.5 in above the edge; docx XENG-001..003 pass (166/166 lines), params.cross_engine: gate (fb-595.68.19)
</commit_message>
<xml_diff>
--- a/courts/fourth-circuit/south-carolina/federal/district/motion-brief/usage/OUTPUT-motion-brief.docx
+++ b/courts/fourth-circuit/south-carolina/federal/district/motion-brief/usage/OUTPUT-motion-brief.docx
@@ -4,111 +4,63 @@
   <w:body>
     <w:p>
       <w:pPr>
-        <w:pStyle w:val="CourtHeading"/>
-      </w:pPr>
-      <w:r>
-        <w:t xml:space="preserve">IN</w:t>
-      </w:r>
-      <w:r>
-        <w:t xml:space="preserve"> </w:t>
-      </w:r>
-      <w:r>
-        <w:t xml:space="preserve">THE</w:t>
-      </w:r>
-      <w:r>
-        <w:t xml:space="preserve"> </w:t>
-      </w:r>
-      <w:r>
-        <w:t xml:space="preserve">UNITED</w:t>
-      </w:r>
-      <w:r>
-        <w:t xml:space="preserve"> </w:t>
-      </w:r>
-      <w:r>
-        <w:t xml:space="preserve">STATES</w:t>
-      </w:r>
-      <w:r>
-        <w:t xml:space="preserve"> </w:t>
-      </w:r>
-      <w:r>
-        <w:t xml:space="preserve">DISTRICT</w:t>
-      </w:r>
-      <w:r>
-        <w:t xml:space="preserve"> </w:t>
-      </w:r>
-      <w:r>
-        <w:t xml:space="preserve">COURT</w:t>
+        <w:keepNext/>
+        <w:keepLines/>
+        <w:spacing w:before="0" w:after="0" w:line="276" w:lineRule="exact"/>
+        <w:ind w:left="0" w:firstLine="0"/>
+        <w:jc w:val="center"/>
+      </w:pPr>
+      <w:r>
+        <w:rPr>
+          <w:b/>
+          <w:bCs/>
+        </w:rPr>
+        <w:t xml:space="preserve">IN THE UNITED STATES DISTRICT COURT</w:t>
       </w:r>
     </w:p>
     <w:p>
       <w:pPr>
-        <w:pStyle w:val="CourtHeading"/>
-      </w:pPr>
-      <w:r>
-        <w:t xml:space="preserve">FOR</w:t>
-      </w:r>
-      <w:r>
-        <w:t xml:space="preserve"> </w:t>
-      </w:r>
-      <w:r>
-        <w:t xml:space="preserve">THE</w:t>
-      </w:r>
-      <w:r>
-        <w:t xml:space="preserve"> </w:t>
-      </w:r>
-      <w:r>
-        <w:t xml:space="preserve">DISTRICT</w:t>
-      </w:r>
-      <w:r>
-        <w:t xml:space="preserve"> </w:t>
-      </w:r>
-      <w:r>
-        <w:t xml:space="preserve">OF</w:t>
-      </w:r>
-      <w:r>
-        <w:t xml:space="preserve"> </w:t>
-      </w:r>
-      <w:r>
-        <w:t xml:space="preserve">SOUTH</w:t>
-      </w:r>
-      <w:r>
-        <w:t xml:space="preserve"> </w:t>
-      </w:r>
-      <w:r>
-        <w:t xml:space="preserve">CAROLINA</w:t>
+        <w:keepNext/>
+        <w:keepLines/>
+        <w:spacing w:before="0" w:after="0" w:line="276" w:lineRule="exact"/>
+        <w:ind w:left="0" w:firstLine="0"/>
+        <w:jc w:val="center"/>
+      </w:pPr>
+      <w:r>
+        <w:rPr>
+          <w:b/>
+          <w:bCs/>
+        </w:rPr>
+        <w:t xml:space="preserve">FOR THE DISTRICT OF SOUTH CAROLINA</w:t>
       </w:r>
     </w:p>
     <w:p>
       <w:pPr>
-        <w:pStyle w:val="CourtHeadingLast"/>
-      </w:pPr>
-      <w:r>
-        <w:t xml:space="preserve">CHARLESTON</w:t>
-      </w:r>
-      <w:r>
-        <w:t xml:space="preserve"> </w:t>
-      </w:r>
-      <w:r>
-        <w:t xml:space="preserve">DIVISION</w:t>
+        <w:keepNext/>
+        <w:keepLines/>
+        <w:spacing w:before="0" w:after="360" w:line="276" w:lineRule="exact"/>
+        <w:ind w:left="0" w:firstLine="0"/>
+        <w:jc w:val="center"/>
+      </w:pPr>
+      <w:r>
+        <w:rPr>
+          <w:b/>
+          <w:bCs/>
+        </w:rPr>
+        <w:t xml:space="preserve">CHARLESTON DIVISION</w:t>
       </w:r>
     </w:p>
     <w:tbl>
       <w:tblPr>
         <w:tblW w:w="9360" w:type="dxa"/>
-        <w:tblBorders>
-          <w:top w:val="nil"/>
-          <w:left w:val="nil"/>
-          <w:bottom w:val="nil"/>
-          <w:right w:val="nil"/>
-          <w:insideH w:val="nil"/>
-          <w:insideV w:val="nil"/>
-        </w:tblBorders>
         <w:tblLayout w:type="fixed"/>
         <w:tblCellMar>
+          <w:top w:w="0" w:type="dxa"/>
           <w:left w:w="0" w:type="dxa"/>
+          <w:bottom w:w="0" w:type="dxa"/>
           <w:right w:w="0" w:type="dxa"/>
         </w:tblCellMar>
-        <w:tblLook w:val="0000" w:firstRow="0" w:lastRow="0" w:firstColumn="0" w:lastColumn="0" w:noHBand="1" w:noVBand="1"/>
+        <w:tblLook w:val="0000" w:firstRow="0" w:lastRow="0" w:firstColumn="0" w:lastColumn="0" w:noHBand="0" w:noVBand="0"/>
       </w:tblPr>
       <w:tblGrid>
         <w:gridCol w:w="5184"/>
@@ -125,9 +77,9 @@
           </w:tcPr>
           <w:p>
             <w:pPr>
-              <w:pStyle w:val="CaptionText"/>
-              <w:spacing w:before="0" w:after="97"/>
-              <w:ind w:left="0"/>
+              <w:spacing w:before="0" w:after="0" w:line="276" w:lineRule="exact"/>
+              <w:ind w:left="0" w:firstLine="0"/>
+              <w:jc w:val="left"/>
             </w:pPr>
             <w:r>
               <w:t xml:space="preserve">UNITED</w:t>
@@ -165,9 +117,9 @@
           </w:p>
           <w:p>
             <w:pPr>
-              <w:pStyle w:val="CaptionText"/>
-              <w:spacing w:before="0" w:after="97"/>
-              <w:ind w:left="720"/>
+              <w:spacing w:before="216" w:after="0" w:line="276" w:lineRule="exact"/>
+              <w:ind w:left="720" w:firstLine="0"/>
+              <w:jc w:val="left"/>
             </w:pPr>
             <w:r>
               <w:t xml:space="preserve">JOHN</w:t>
@@ -181,9 +133,9 @@
           </w:p>
           <w:p>
             <w:pPr>
-              <w:pStyle w:val="CaptionText"/>
-              <w:spacing w:before="0" w:after="97"/>
-              <w:ind w:left="1440"/>
+              <w:spacing w:before="216" w:after="0" w:line="276" w:lineRule="exact"/>
+              <w:ind w:left="1440" w:firstLine="0"/>
+              <w:jc w:val="left"/>
             </w:pPr>
             <w:r>
               <w:t xml:space="preserve">Plaintiff-Relator,</w:t>
@@ -191,9 +143,9 @@
           </w:p>
           <w:p>
             <w:pPr>
-              <w:pStyle w:val="CaptionText"/>
-              <w:spacing w:before="0" w:after="97"/>
-              <w:ind w:left="720"/>
+              <w:spacing w:before="216" w:after="0" w:line="276" w:lineRule="exact"/>
+              <w:ind w:left="720" w:firstLine="0"/>
+              <w:jc w:val="left"/>
             </w:pPr>
             <w:r>
               <w:t xml:space="preserve">v.</w:t>
@@ -201,9 +153,9 @@
           </w:p>
           <w:p>
             <w:pPr>
-              <w:pStyle w:val="CaptionText"/>
-              <w:spacing w:before="0" w:after="97"/>
-              <w:ind w:left="0"/>
+              <w:spacing w:before="216" w:after="0" w:line="276" w:lineRule="exact"/>
+              <w:ind w:left="0" w:firstLine="0"/>
+              <w:jc w:val="left"/>
             </w:pPr>
             <w:r>
               <w:t xml:space="preserve">CHARLESTON</w:t>
@@ -229,9 +181,9 @@
           </w:p>
           <w:p>
             <w:pPr>
-              <w:pStyle w:val="CaptionText"/>
-              <w:spacing w:before="0" w:after="0"/>
-              <w:ind w:left="1440"/>
+              <w:spacing w:before="216" w:after="0" w:line="276" w:lineRule="exact"/>
+              <w:ind w:left="1440" w:firstLine="0"/>
+              <w:jc w:val="left"/>
             </w:pPr>
             <w:r>
               <w:t xml:space="preserve">Defendant.</w:t>
@@ -244,8 +196,8 @@
           </w:tcPr>
           <w:p>
             <w:pPr>
-              <w:pStyle w:val="CaptionText"/>
-              <w:spacing w:before="0" w:after="97"/>
+              <w:spacing w:before="0" w:after="0" w:line="276" w:lineRule="exact"/>
+              <w:ind w:left="0" w:firstLine="0"/>
               <w:jc w:val="center"/>
             </w:pPr>
             <w:r>
@@ -254,8 +206,8 @@
           </w:p>
           <w:p>
             <w:pPr>
-              <w:pStyle w:val="CaptionText"/>
-              <w:spacing w:before="0" w:after="97"/>
+              <w:spacing w:before="216" w:after="0" w:line="276" w:lineRule="exact"/>
+              <w:ind w:left="0" w:firstLine="0"/>
               <w:jc w:val="center"/>
             </w:pPr>
             <w:r>
@@ -264,8 +216,8 @@
           </w:p>
           <w:p>
             <w:pPr>
-              <w:pStyle w:val="CaptionText"/>
-              <w:spacing w:before="0" w:after="97"/>
+              <w:spacing w:before="216" w:after="0" w:line="276" w:lineRule="exact"/>
+              <w:ind w:left="0" w:firstLine="0"/>
               <w:jc w:val="center"/>
             </w:pPr>
             <w:r>
@@ -274,8 +226,8 @@
           </w:p>
           <w:p>
             <w:pPr>
-              <w:pStyle w:val="CaptionText"/>
-              <w:spacing w:before="0" w:after="97"/>
+              <w:spacing w:before="216" w:after="0" w:line="276" w:lineRule="exact"/>
+              <w:ind w:left="0" w:firstLine="0"/>
               <w:jc w:val="center"/>
             </w:pPr>
             <w:r>
@@ -284,8 +236,8 @@
           </w:p>
           <w:p>
             <w:pPr>
-              <w:pStyle w:val="CaptionText"/>
-              <w:spacing w:before="0" w:after="97"/>
+              <w:spacing w:before="216" w:after="0" w:line="276" w:lineRule="exact"/>
+              <w:ind w:left="0" w:firstLine="0"/>
               <w:jc w:val="center"/>
             </w:pPr>
             <w:r>
@@ -294,8 +246,8 @@
           </w:p>
           <w:p>
             <w:pPr>
-              <w:pStyle w:val="CaptionText"/>
-              <w:spacing w:before="0" w:after="0"/>
+              <w:spacing w:before="216" w:after="0" w:line="276" w:lineRule="exact"/>
+              <w:ind w:left="0" w:firstLine="0"/>
               <w:jc w:val="center"/>
             </w:pPr>
             <w:r>
@@ -309,8 +261,9 @@
           </w:tcPr>
           <w:p>
             <w:pPr>
-              <w:pStyle w:val="CaptionText"/>
-              <w:spacing w:before="0" w:after="0"/>
+              <w:spacing w:before="0" w:after="0" w:line="276" w:lineRule="exact"/>
+              <w:ind w:left="0" w:firstLine="0"/>
+              <w:jc w:val="left"/>
             </w:pPr>
             <w:r>
               <w:t xml:space="preserve">CASE</w:t>
@@ -325,7 +278,9 @@
               <w:t xml:space="preserve"> </w:t>
             </w:r>
             <w:r>
-              <w:t xml:space="preserve">2:25-cv-08752-DCN</w:t>
+              <w:t xml:space="preserve">2:25-cv</w:t>
+              <w:noBreakHyphen/>
+              <w:t xml:space="preserve">08752-DCN</w:t>
             </w:r>
           </w:p>
         </w:tc>
@@ -333,72 +288,152 @@
     </w:tbl>
     <w:p>
       <w:pPr>
-        <w:pStyle w:val="DocumentTitle"/>
-      </w:pPr>
-      <w:r>
-        <w:t xml:space="preserve">Defendant’s</w:t>
-      </w:r>
-      <w:r>
-        <w:t xml:space="preserve"> </w:t>
-      </w:r>
-      <w:r>
-        <w:t xml:space="preserve">Memorandum</w:t>
-      </w:r>
-      <w:r>
-        <w:t xml:space="preserve"> </w:t>
-      </w:r>
-      <w:r>
-        <w:t xml:space="preserve">in</w:t>
-      </w:r>
-      <w:r>
-        <w:t xml:space="preserve"> </w:t>
-      </w:r>
-      <w:r>
-        <w:t xml:space="preserve">Support</w:t>
-      </w:r>
-      <w:r>
-        <w:t xml:space="preserve"> </w:t>
-      </w:r>
-      <w:r>
-        <w:t xml:space="preserve">of</w:t>
-      </w:r>
-      <w:r>
-        <w:t xml:space="preserve"> </w:t>
-      </w:r>
-      <w:r>
-        <w:t xml:space="preserve">Motion</w:t>
-      </w:r>
-      <w:r>
-        <w:t xml:space="preserve"> </w:t>
-      </w:r>
-      <w:r>
-        <w:t xml:space="preserve">to</w:t>
-      </w:r>
-      <w:r>
-        <w:t xml:space="preserve"> </w:t>
-      </w:r>
-      <w:r>
-        <w:t xml:space="preserve">Dismiss</w:t>
-      </w:r>
-      <w:r>
-        <w:t xml:space="preserve"> </w:t>
-      </w:r>
-      <w:r>
-        <w:t xml:space="preserve">Amended</w:t>
-      </w:r>
-      <w:r>
-        <w:t xml:space="preserve"> </w:t>
-      </w:r>
-      <w:r>
-        <w:t xml:space="preserve">Complaint</w:t>
+        <w:keepNext/>
+        <w:keepLines/>
+        <w:spacing w:before="360" w:after="288" w:line="276" w:lineRule="exact"/>
+        <w:ind w:left="0" w:firstLine="0"/>
+        <w:jc w:val="center"/>
+      </w:pPr>
+      <w:r>
+        <w:rPr>
+          <w:b/>
+          <w:bCs/>
+        </w:rPr>
+        <w:t xml:space="preserve">DEFENDANT’S</w:t>
+      </w:r>
+      <w:r>
+        <w:rPr>
+          <w:b/>
+          <w:bCs/>
+        </w:rPr>
+        <w:t xml:space="preserve"> </w:t>
+      </w:r>
+      <w:r>
+        <w:rPr>
+          <w:b/>
+          <w:bCs/>
+        </w:rPr>
+        <w:t xml:space="preserve">MEMORANDUM</w:t>
+      </w:r>
+      <w:r>
+        <w:rPr>
+          <w:b/>
+          <w:bCs/>
+        </w:rPr>
+        <w:t xml:space="preserve"> </w:t>
+      </w:r>
+      <w:r>
+        <w:rPr>
+          <w:b/>
+          <w:bCs/>
+        </w:rPr>
+        <w:t xml:space="preserve">IN</w:t>
+      </w:r>
+      <w:r>
+        <w:rPr>
+          <w:b/>
+          <w:bCs/>
+        </w:rPr>
+        <w:t xml:space="preserve"> </w:t>
+      </w:r>
+      <w:r>
+        <w:rPr>
+          <w:b/>
+          <w:bCs/>
+        </w:rPr>
+        <w:t xml:space="preserve">SUPPORT</w:t>
+      </w:r>
+      <w:r>
+        <w:rPr>
+          <w:b/>
+          <w:bCs/>
+        </w:rPr>
+        <w:t xml:space="preserve"> </w:t>
+      </w:r>
+      <w:r>
+        <w:rPr>
+          <w:b/>
+          <w:bCs/>
+        </w:rPr>
+        <w:t xml:space="preserve">OF</w:t>
+      </w:r>
+      <w:r>
+        <w:rPr>
+          <w:b/>
+          <w:bCs/>
+        </w:rPr>
+        <w:t xml:space="preserve"> </w:t>
+      </w:r>
+      <w:r>
+        <w:rPr>
+          <w:b/>
+          <w:bCs/>
+        </w:rPr>
+        <w:t xml:space="preserve">MOTION</w:t>
+      </w:r>
+      <w:r>
+        <w:rPr>
+          <w:b/>
+          <w:bCs/>
+        </w:rPr>
+        <w:t xml:space="preserve"> </w:t>
+      </w:r>
+      <w:r>
+        <w:rPr>
+          <w:b/>
+          <w:bCs/>
+        </w:rPr>
+        <w:t xml:space="preserve">TO</w:t>
+      </w:r>
+      <w:r>
+        <w:rPr>
+          <w:b/>
+          <w:bCs/>
+        </w:rPr>
+        <w:t xml:space="preserve"> </w:t>
+      </w:r>
+      <w:r>
+        <w:rPr>
+          <w:b/>
+          <w:bCs/>
+        </w:rPr>
+        <w:t xml:space="preserve">DISMISS</w:t>
+      </w:r>
+      <w:r>
+        <w:rPr>
+          <w:b/>
+          <w:bCs/>
+        </w:rPr>
+        <w:t xml:space="preserve"> </w:t>
+      </w:r>
+      <w:r>
+        <w:rPr>
+          <w:b/>
+          <w:bCs/>
+        </w:rPr>
+        <w:t xml:space="preserve">AMENDED</w:t>
+      </w:r>
+      <w:r>
+        <w:rPr>
+          <w:b/>
+          <w:bCs/>
+        </w:rPr>
+        <w:t xml:space="preserve"> </w:t>
+      </w:r>
+      <w:r>
+        <w:rPr>
+          <w:b/>
+          <w:bCs/>
+        </w:rPr>
+        <w:t xml:space="preserve">COMPLAINT</w:t>
       </w:r>
     </w:p>
     <w:p>
       <w:pPr>
-        <w:pStyle w:val="FirstParagraph"/>
-      </w:pPr>
-      <w:r>
-        <w:t xml:space="preserve">Defendant Charleston County School District (the “District”), by and through its undersigned counsel, hereby moves to dismiss the Amended Complaint under Federal Rule of Civil Procedure 12(b)(6) for failure to state a claim. In short, the Complaint alleges violation of the False Claims Act but fails to “describe the time, place, and contents of the false representations, as well as the identity of the person making the misrepresentation and what he obtained thereby.”</w:t>
+        <w:pStyle w:val="BodyText"/>
+      </w:pPr>
+      <w:r>
+        <w:t xml:space="preserve">Defendant Charleston County School District (the “District”), by and through its undersigned counsel, hereby moves to dismiss the Amended Complaint under Federal Rule of Civil Procedure 12(b)⁠(6) for failure to state a claim. In short, the Complaint alleges violation of the False Claims Act but fails to “describe the time, place, and contents of the false representations, as well as the identity of the person making the misrepresentation and what he obtained thereby.”</w:t>
       </w:r>
       <w:r>
         <w:t xml:space="preserve"> </w:t>
@@ -430,16 +465,23 @@
     <w:p>
       <w:pPr>
         <w:pStyle w:val="Heading2"/>
-      </w:pPr>
-      <w:bookmarkStart w:id="9" w:name="_introduction"/>
-      <w:r>
+        <w:keepNext/>
+        <w:keepLines/>
+        <w:spacing w:before="288" w:after="216" w:line="276" w:lineRule="exact"/>
+        <w:ind w:left="0" w:firstLine="0"/>
+        <w:jc w:val="center"/>
+      </w:pPr>
+      <w:r>
+        <w:rPr>
+          <w:b/>
+          <w:bCs/>
+        </w:rPr>
         <w:t xml:space="preserve">INTRODUCTION</w:t>
       </w:r>
-      <w:bookmarkEnd w:id="9"/>
     </w:p>
     <w:p>
       <w:pPr>
-        <w:pStyle w:val="FirstParagraph"/>
+        <w:pStyle w:val="BodyTextNote"/>
       </w:pPr>
       <w:r>
         <w:t xml:space="preserve">Plaintiff John Cobb (“Plaintiff”)</w:t>
@@ -448,7 +490,7 @@
         <w:rPr>
           <w:rStyle w:val="FootnoteReference"/>
         </w:rPr>
-        <w:footnoteReference w:id="10"/>
+        <w:footnoteReference w:id="9"/>
       </w:r>
       <w:r>
         <w:t xml:space="preserve"> </w:t>
@@ -462,7 +504,7 @@
         <w:pStyle w:val="BodyText"/>
       </w:pPr>
       <w:r>
-        <w:t xml:space="preserve">Plaintiff’s Amended Complaint (ECF #23), while lengthier, fails to satisfy the pleading requirements of Rules 9(b) and 12(b)(6). The Amended Complaint fails to “connect the dots…between the alleged false claims and government payment.”</w:t>
+        <w:t xml:space="preserve">Plaintiff’s Amended Complaint (ECF #23), while lengthier, fails to satisfy the pleading requirements of Rules 9(b) and 12(b)⁠(6). The Amended Complaint fails to “connect the dots…between the alleged false claims and government payment.”</w:t>
       </w:r>
       <w:r>
         <w:t xml:space="preserve"> </w:t>
@@ -481,29 +523,141 @@
     <w:p>
       <w:pPr>
         <w:pStyle w:val="Heading2"/>
-      </w:pPr>
-      <w:bookmarkStart w:id="11" w:name="_f71bb8ee81b7f5e1fea0089ad4ffa65b0be4956"/>
-      <w:r>
-        <w:t xml:space="preserve">LEGAL STANDARD</w:t>
-      </w:r>
-      <w:bookmarkEnd w:id="11"/>
+        <w:keepNext/>
+        <w:keepLines/>
+        <w:spacing w:before="288" w:after="216" w:line="276" w:lineRule="exact"/>
+        <w:ind w:left="0" w:firstLine="0"/>
+        <w:jc w:val="center"/>
+      </w:pPr>
+      <w:r>
+        <w:rPr>
+          <w:b/>
+          <w:bCs/>
+        </w:rPr>
+        <w:t xml:space="preserve">LEGAL</w:t>
+      </w:r>
+      <w:r>
+        <w:rPr>
+          <w:b/>
+          <w:bCs/>
+        </w:rPr>
+        <w:t xml:space="preserve"> </w:t>
+      </w:r>
+      <w:r>
+        <w:rPr>
+          <w:b/>
+          <w:bCs/>
+        </w:rPr>
+        <w:t xml:space="preserve">STANDARD</w:t>
+      </w:r>
     </w:p>
     <w:p>
       <w:pPr>
         <w:pStyle w:val="Heading3"/>
-      </w:pPr>
-      <w:bookmarkStart w:id="12" w:name="_eac454c5eccf9632d130cdbdeadb4581c1af105"/>
-      <w:r>
-        <w:t xml:space="preserve">I. Federal Rule of Civil Procedure 12(b)(6)</w:t>
-      </w:r>
-      <w:bookmarkEnd w:id="12"/>
+        <w:keepNext/>
+        <w:keepLines/>
+        <w:spacing w:before="240" w:after="216" w:line="276" w:lineRule="exact"/>
+        <w:ind w:left="0" w:firstLine="0"/>
+        <w:jc w:val="left"/>
+      </w:pPr>
+      <w:r>
+        <w:rPr>
+          <w:b/>
+          <w:bCs/>
+        </w:rPr>
+        <w:t xml:space="preserve">I.</w:t>
+      </w:r>
+      <w:r>
+        <w:rPr>
+          <w:b/>
+          <w:bCs/>
+        </w:rPr>
+        <w:t xml:space="preserve"> </w:t>
+      </w:r>
+      <w:r>
+        <w:rPr>
+          <w:b/>
+          <w:bCs/>
+        </w:rPr>
+        <w:t xml:space="preserve">Federal</w:t>
+      </w:r>
+      <w:r>
+        <w:rPr>
+          <w:b/>
+          <w:bCs/>
+        </w:rPr>
+        <w:t xml:space="preserve"> </w:t>
+      </w:r>
+      <w:r>
+        <w:rPr>
+          <w:b/>
+          <w:bCs/>
+        </w:rPr>
+        <w:t xml:space="preserve">Rule</w:t>
+      </w:r>
+      <w:r>
+        <w:rPr>
+          <w:b/>
+          <w:bCs/>
+        </w:rPr>
+        <w:t xml:space="preserve"> </w:t>
+      </w:r>
+      <w:r>
+        <w:rPr>
+          <w:b/>
+          <w:bCs/>
+        </w:rPr>
+        <w:t xml:space="preserve">of</w:t>
+      </w:r>
+      <w:r>
+        <w:rPr>
+          <w:b/>
+          <w:bCs/>
+        </w:rPr>
+        <w:t xml:space="preserve"> </w:t>
+      </w:r>
+      <w:r>
+        <w:rPr>
+          <w:b/>
+          <w:bCs/>
+        </w:rPr>
+        <w:t xml:space="preserve">Civil</w:t>
+      </w:r>
+      <w:r>
+        <w:rPr>
+          <w:b/>
+          <w:bCs/>
+        </w:rPr>
+        <w:t xml:space="preserve"> </w:t>
+      </w:r>
+      <w:r>
+        <w:rPr>
+          <w:b/>
+          <w:bCs/>
+        </w:rPr>
+        <w:t xml:space="preserve">Procedure</w:t>
+      </w:r>
+      <w:r>
+        <w:rPr>
+          <w:b/>
+          <w:bCs/>
+        </w:rPr>
+        <w:t xml:space="preserve"> </w:t>
+      </w:r>
+      <w:r>
+        <w:rPr>
+          <w:b/>
+          <w:bCs/>
+        </w:rPr>
+        <w:t xml:space="preserve">12(b)⁠(6)</w:t>
+      </w:r>
     </w:p>
     <w:p>
       <w:pPr>
-        <w:pStyle w:val="FirstParagraph"/>
-      </w:pPr>
-      <w:r>
-        <w:t xml:space="preserve">A motion to dismiss under Federal Rule of Civil Procedure 12(b)(6) challenges the legal sufficiency of the facts alleged in the complaint.</w:t>
+        <w:pStyle w:val="BodyText"/>
+      </w:pPr>
+      <w:r>
+        <w:t xml:space="preserve">A motion to dismiss under Federal Rule of Civil Procedure 12(b)⁠(6) challenges the legal sufficiency of the facts alleged in the complaint.</w:t>
       </w:r>
       <w:r>
         <w:t xml:space="preserve"> </w:t>
@@ -526,7 +680,7 @@
           <w:i/>
           <w:iCs/>
         </w:rPr>
-        <w:t xml:space="preserve">Bell Atlantic Corp. v. Twombly</w:t>
+        <w:t xml:space="preserve">Bell Atlantic Corp. v. Twombly</w:t>
       </w:r>
       <w:r>
         <w:t xml:space="preserve">, 550 U.S. 544, 570 (2007), and must “allow[ ] the court to draw the reasonable inference that the defendant is liable for the misconduct alleged,”</w:t>
@@ -555,7 +709,7 @@
         <w:t xml:space="preserve">Erickson v. Pardus</w:t>
       </w:r>
       <w:r>
-        <w:t xml:space="preserve">, 551 U.S. 89, 94 (2007). However, “when the allegations in a complaint, however true, could not raise a claim of entitlement to relief, this basic deficiency should . . . be exposed at the point of minimum expenditure of time and money by the parties and the court.</w:t>
+        <w:t xml:space="preserve">, 551 U.S. 89, 94 (2007). However, “when the allegations in a complaint, however true, could not raise a claim of entitlement to relief, this basic deficiency should . . . be exposed at the point of minimum expenditure of time and money by the parties and the court.</w:t>
       </w:r>
       <w:r>
         <w:t xml:space="preserve"> </w:t>
@@ -587,16 +741,107 @@
     <w:p>
       <w:pPr>
         <w:pStyle w:val="Heading3"/>
-      </w:pPr>
-      <w:bookmarkStart w:id="13" w:name="_6ff2019f286a62f340c45d7096331e0b5c0eaee"/>
-      <w:r>
-        <w:t xml:space="preserve">II. Federal Rule of Civil Procedure 9(b)</w:t>
-      </w:r>
-      <w:bookmarkEnd w:id="13"/>
+        <w:keepNext/>
+        <w:keepLines/>
+        <w:spacing w:before="240" w:after="216" w:line="276" w:lineRule="exact"/>
+        <w:ind w:left="0" w:firstLine="0"/>
+        <w:jc w:val="left"/>
+      </w:pPr>
+      <w:r>
+        <w:rPr>
+          <w:b/>
+          <w:bCs/>
+        </w:rPr>
+        <w:t xml:space="preserve">II.</w:t>
+      </w:r>
+      <w:r>
+        <w:rPr>
+          <w:b/>
+          <w:bCs/>
+        </w:rPr>
+        <w:t xml:space="preserve"> </w:t>
+      </w:r>
+      <w:r>
+        <w:rPr>
+          <w:b/>
+          <w:bCs/>
+        </w:rPr>
+        <w:t xml:space="preserve">Federal</w:t>
+      </w:r>
+      <w:r>
+        <w:rPr>
+          <w:b/>
+          <w:bCs/>
+        </w:rPr>
+        <w:t xml:space="preserve"> </w:t>
+      </w:r>
+      <w:r>
+        <w:rPr>
+          <w:b/>
+          <w:bCs/>
+        </w:rPr>
+        <w:t xml:space="preserve">Rule</w:t>
+      </w:r>
+      <w:r>
+        <w:rPr>
+          <w:b/>
+          <w:bCs/>
+        </w:rPr>
+        <w:t xml:space="preserve"> </w:t>
+      </w:r>
+      <w:r>
+        <w:rPr>
+          <w:b/>
+          <w:bCs/>
+        </w:rPr>
+        <w:t xml:space="preserve">of</w:t>
+      </w:r>
+      <w:r>
+        <w:rPr>
+          <w:b/>
+          <w:bCs/>
+        </w:rPr>
+        <w:t xml:space="preserve"> </w:t>
+      </w:r>
+      <w:r>
+        <w:rPr>
+          <w:b/>
+          <w:bCs/>
+        </w:rPr>
+        <w:t xml:space="preserve">Civil</w:t>
+      </w:r>
+      <w:r>
+        <w:rPr>
+          <w:b/>
+          <w:bCs/>
+        </w:rPr>
+        <w:t xml:space="preserve"> </w:t>
+      </w:r>
+      <w:r>
+        <w:rPr>
+          <w:b/>
+          <w:bCs/>
+        </w:rPr>
+        <w:t xml:space="preserve">Procedure</w:t>
+      </w:r>
+      <w:r>
+        <w:rPr>
+          <w:b/>
+          <w:bCs/>
+        </w:rPr>
+        <w:t xml:space="preserve"> </w:t>
+      </w:r>
+      <w:r>
+        <w:rPr>
+          <w:b/>
+          <w:bCs/>
+        </w:rPr>
+        <w:t xml:space="preserve">9(b)</w:t>
+      </w:r>
     </w:p>
     <w:p>
       <w:pPr>
-        <w:pStyle w:val="FirstParagraph"/>
+        <w:pStyle w:val="BodyText"/>
       </w:pPr>
       <w:r>
         <w:t xml:space="preserve">Federal Rule of Civil Procedure 9 governs the pleading of special matters and subsection (b) mandates that when alleging fraud, a party “must state with particularity the circumstances constituting fraud or mistake.” Fed. R. Civ. P. 9(b). In addition to meeting the plausibility standard of</w:t>
@@ -683,12 +928,12 @@
         <w:pStyle w:val="BlockText"/>
       </w:pPr>
       <w:r>
-        <w:t xml:space="preserve">The multiple purposes of Rule 9(b), namely, of providing notice to a defendant of its alleged misconduct, of preventing frivolous suits, of “eliminat[ing] fraud actions in which all the facts are learned after discovery,” and of “protect[ing] defendants from harm to their goodwill and reputation,” are as applicable in cases brought under the Act as they are in other fraud cases. Indeed, such purposes may apply with particular force in the context of the Act, given the potential consequences flowing from allegations of fraud by companies who transact business with the government. Moreover, we have emphasized that a claim brought under the Act that “rest[s] primarily on facts learned through the costly process of discovery . . . is precisely what Rule 9(b) seeks to prevent.”</w:t>
+        <w:t xml:space="preserve">The multiple purposes of Rule 9(b), namely, of providing notice to a defendant of its alleged misconduct, of preventing frivolous suits, of “eliminat[ing] fraud actions in which all the facts are learned after discovery,” and of “protect[ing] defendants from harm to their goodwill and reputation,” are as applicable in cases brought under the Act as they are in other fraud cases. Indeed, such purposes may apply with particular force in the context of the Act, given the potential consequences flowing from allegations of fraud by companies who transact business with the government. Moreover, we have emphasized that a claim brought under the Act that “rest[s] primarily on facts learned through the costly process of discovery . . . is precisely what Rule 9(b) seeks to prevent.”</w:t>
       </w:r>
     </w:p>
     <w:p>
       <w:pPr>
-        <w:pStyle w:val="FirstParagraph"/>
+        <w:pStyle w:val="BodyText"/>
       </w:pPr>
       <w:r>
         <w:rPr>
@@ -717,29 +962,211 @@
     <w:p>
       <w:pPr>
         <w:pStyle w:val="Heading2"/>
-      </w:pPr>
-      <w:bookmarkStart w:id="14" w:name="_argument"/>
-      <w:r>
+        <w:keepNext/>
+        <w:keepLines/>
+        <w:spacing w:before="288" w:after="216" w:line="276" w:lineRule="exact"/>
+        <w:ind w:left="0" w:firstLine="0"/>
+        <w:jc w:val="center"/>
+      </w:pPr>
+      <w:r>
+        <w:rPr>
+          <w:b/>
+          <w:bCs/>
+        </w:rPr>
         <w:t xml:space="preserve">ARGUMENT</w:t>
       </w:r>
-      <w:bookmarkEnd w:id="14"/>
     </w:p>
     <w:p>
       <w:pPr>
         <w:pStyle w:val="Heading3"/>
-      </w:pPr>
-      <w:bookmarkStart w:id="15" w:name="_53386debe69cb6d5e8f57916de7ddfdf9eecc86"/>
-      <w:r>
-        <w:t xml:space="preserve">I. Plaintiff Fails to Sufficiently Plead a Violation of the False Claims Act.</w:t>
-      </w:r>
-      <w:bookmarkEnd w:id="15"/>
+        <w:keepNext/>
+        <w:keepLines/>
+        <w:spacing w:before="240" w:after="216" w:line="276" w:lineRule="exact"/>
+        <w:ind w:left="0" w:firstLine="0"/>
+        <w:jc w:val="left"/>
+      </w:pPr>
+      <w:r>
+        <w:rPr>
+          <w:b/>
+          <w:bCs/>
+        </w:rPr>
+        <w:t xml:space="preserve">I.</w:t>
+      </w:r>
+      <w:r>
+        <w:rPr>
+          <w:b/>
+          <w:bCs/>
+        </w:rPr>
+        <w:t xml:space="preserve"> </w:t>
+      </w:r>
+      <w:r>
+        <w:rPr>
+          <w:b/>
+          <w:bCs/>
+        </w:rPr>
+        <w:t xml:space="preserve">Plaintiff</w:t>
+      </w:r>
+      <w:r>
+        <w:rPr>
+          <w:b/>
+          <w:bCs/>
+        </w:rPr>
+        <w:t xml:space="preserve"> </w:t>
+      </w:r>
+      <w:r>
+        <w:rPr>
+          <w:b/>
+          <w:bCs/>
+        </w:rPr>
+        <w:t xml:space="preserve">Fails</w:t>
+      </w:r>
+      <w:r>
+        <w:rPr>
+          <w:b/>
+          <w:bCs/>
+        </w:rPr>
+        <w:t xml:space="preserve"> </w:t>
+      </w:r>
+      <w:r>
+        <w:rPr>
+          <w:b/>
+          <w:bCs/>
+        </w:rPr>
+        <w:t xml:space="preserve">to</w:t>
+      </w:r>
+      <w:r>
+        <w:rPr>
+          <w:b/>
+          <w:bCs/>
+        </w:rPr>
+        <w:t xml:space="preserve"> </w:t>
+      </w:r>
+      <w:r>
+        <w:rPr>
+          <w:b/>
+          <w:bCs/>
+        </w:rPr>
+        <w:t xml:space="preserve">Sufficiently</w:t>
+      </w:r>
+      <w:r>
+        <w:rPr>
+          <w:b/>
+          <w:bCs/>
+        </w:rPr>
+        <w:t xml:space="preserve"> </w:t>
+      </w:r>
+      <w:r>
+        <w:rPr>
+          <w:b/>
+          <w:bCs/>
+        </w:rPr>
+        <w:t xml:space="preserve">Plead</w:t>
+      </w:r>
+      <w:r>
+        <w:rPr>
+          <w:b/>
+          <w:bCs/>
+        </w:rPr>
+        <w:t xml:space="preserve"> </w:t>
+      </w:r>
+      <w:r>
+        <w:rPr>
+          <w:b/>
+          <w:bCs/>
+        </w:rPr>
+        <w:t xml:space="preserve">a</w:t>
+      </w:r>
+      <w:r>
+        <w:rPr>
+          <w:b/>
+          <w:bCs/>
+        </w:rPr>
+        <w:t xml:space="preserve"> </w:t>
+      </w:r>
+      <w:r>
+        <w:rPr>
+          <w:b/>
+          <w:bCs/>
+        </w:rPr>
+        <w:t xml:space="preserve">Violation</w:t>
+      </w:r>
+      <w:r>
+        <w:rPr>
+          <w:b/>
+          <w:bCs/>
+        </w:rPr>
+        <w:t xml:space="preserve"> </w:t>
+      </w:r>
+      <w:r>
+        <w:rPr>
+          <w:b/>
+          <w:bCs/>
+        </w:rPr>
+        <w:t xml:space="preserve">of</w:t>
+      </w:r>
+      <w:r>
+        <w:rPr>
+          <w:b/>
+          <w:bCs/>
+        </w:rPr>
+        <w:t xml:space="preserve"> </w:t>
+      </w:r>
+      <w:r>
+        <w:rPr>
+          <w:b/>
+          <w:bCs/>
+        </w:rPr>
+        <w:t xml:space="preserve">the</w:t>
+      </w:r>
+      <w:r>
+        <w:rPr>
+          <w:b/>
+          <w:bCs/>
+        </w:rPr>
+        <w:t xml:space="preserve"> </w:t>
+      </w:r>
+      <w:r>
+        <w:rPr>
+          <w:b/>
+          <w:bCs/>
+        </w:rPr>
+        <w:t xml:space="preserve">False</w:t>
+      </w:r>
+      <w:r>
+        <w:rPr>
+          <w:b/>
+          <w:bCs/>
+        </w:rPr>
+        <w:t xml:space="preserve"> </w:t>
+      </w:r>
+      <w:r>
+        <w:rPr>
+          <w:b/>
+          <w:bCs/>
+        </w:rPr>
+        <w:t xml:space="preserve">Claims</w:t>
+      </w:r>
+      <w:r>
+        <w:rPr>
+          <w:b/>
+          <w:bCs/>
+        </w:rPr>
+        <w:t xml:space="preserve"> </w:t>
+      </w:r>
+      <w:r>
+        <w:rPr>
+          <w:b/>
+          <w:bCs/>
+        </w:rPr>
+        <w:t xml:space="preserve">Act.</w:t>
+      </w:r>
     </w:p>
     <w:p>
       <w:pPr>
-        <w:pStyle w:val="FirstParagraph"/>
-      </w:pPr>
-      <w:r>
-        <w:t xml:space="preserve">The FCA is an anti-fraud statute that imposes liability for those who make false statements and submit false claims to the Government. 31 U.S.C. § 3729(a)(1). “A false statement is actionable under the Act only if it constitutes a ‘false or fraudulent</w:t>
+        <w:pStyle w:val="BodyText"/>
+      </w:pPr>
+      <w:r>
+        <w:t xml:space="preserve">The FCA is an anti-fraud statute that imposes liability for those who make false statements and submit false claims to the Government. 31 U.S.C. § 3729(a)⁠(1). “A false statement is actionable under the Act only if it constitutes a ‘false or fraudulent</w:t>
       </w:r>
       <w:r>
         <w:t xml:space="preserve"> </w:t>
@@ -775,7 +1202,7 @@
           <w:i/>
           <w:iCs/>
         </w:rPr>
-        <w:t xml:space="preserve">United States ex rel. Harrison v. Westinghouse Savannah River Co. (Harrison II)</w:t>
+        <w:t xml:space="preserve">United States ex rel. Harrison v. Westinghouse Savannah River Co. (Harrison II)</w:t>
       </w:r>
       <w:r>
         <w:t xml:space="preserve">, 352 F.3d 908, 913 (4th Cir. 2003). “Failure to adequately allege any of these elements dooms a claim.”</w:t>
@@ -812,7 +1239,7 @@
         <w:pStyle w:val="BodyText"/>
       </w:pPr>
       <w:r>
-        <w:t xml:space="preserve">In his Amended Complaint, Plaintiff alleges that the District obtained ESSER/CARES funds by submitting Expenditure Reports for reimbursement to the S.C. Department of Education. (ECF #23, ¶ 24) He alleges that by virtue of a certification contained within the Expenditure Reports, the District made three express representations each time it submitted a Report: first, that the expenditures were incurred and paid in accordance with program rules and regulations; second, that payment was not duplicated or reimbursed from any other source; and third, that substantiating invoices and records were on file and available for audit. (</w:t>
+        <w:t xml:space="preserve">In his Amended Complaint, Plaintiff alleges that the District obtained ESSER/​CARES funds by submitting Expenditure Reports for reimbursement to the S.C. Department of Education. (ECF #23, ¶ 24) He alleges that by virtue of a certification contained within the Expenditure Reports, the District made three express representations each time it submitted a Report: first, that the expenditures were incurred and paid in accordance with program rules and regulations; second, that payment was not duplicated or reimbursed from any other source; and third, that substantiating invoices and records were on file and available for audit. (</w:t>
       </w:r>
       <w:r>
         <w:rPr>
@@ -822,7 +1249,7 @@
         <w:t xml:space="preserve">Id.</w:t>
       </w:r>
       <w:r>
-        <w:t xml:space="preserve">, ¶ 26)</w:t>
+        <w:t xml:space="preserve">, ¶ 26)</w:t>
       </w:r>
     </w:p>
     <w:p>
@@ -848,7 +1275,7 @@
         <w:pStyle w:val="BodyText"/>
       </w:pPr>
       <w:r>
-        <w:t xml:space="preserve">The first project described in the Amended Complaint is the District 23 St. Paul’s (“D23SP”) project which “was designed to provide social and emotional support, including theater programs, teacher training, teacher salary, consultant salaries, community involvement and other related expenses.” (</w:t>
+        <w:t xml:space="preserve">The first project described in the Amended Complaint is the District 23 St. Paul’s (“D23SP”) project which “was designed to provide social and emotional support, including theater programs, teacher training, teacher salary, consultant salaries, community involvement and other related expenses.” (</w:t>
       </w:r>
       <w:r>
         <w:rPr>
@@ -858,7 +1285,7 @@
         <w:t xml:space="preserve">Id.</w:t>
       </w:r>
       <w:r>
-        <w:t xml:space="preserve">, ¶ 40) Plaintiff alleges that hiring of the D23SP project manager, Victor Young, was improper because it failed to follow standard procurement procedures and, therefore, that federal funds were misused by virtue of the District’s payments to Young. (</w:t>
+        <w:t xml:space="preserve">, ¶ 40) Plaintiff alleges that hiring of the D23SP project manager, Victor Young, was improper because it failed to follow standard procurement procedures and, therefore, that federal funds were misused by virtue of the District’s payments to Young. (</w:t>
       </w:r>
       <w:r>
         <w:rPr>
@@ -868,7 +1295,19 @@
         <w:t xml:space="preserve">Id.</w:t>
       </w:r>
       <w:r>
-        <w:t xml:space="preserve">, ¶¶ 40, 42-43) Also in relation to the D23SP project, Plaintiff alleges that Charleston Stage was wrongfully paid $221,000 of federal funding because: 1) the contract with Charleston Stage did not follow proper procurement procedures; and 2) the funds were used for “general school enrichment activities rather than their intended purpose of COVID-19 recovery.” (</w:t>
+        <w:t xml:space="preserve">, ¶¶ 40, 42</w:t>
+      </w:r>
+      <w:r>
+        <w:noBreakHyphen/>
+      </w:r>
+      <w:r>
+        <w:t xml:space="preserve">43) Also in relation to the D23SP project, Plaintiff alleges that Charleston Stage was wrongfully paid $221,000 of federal funding because: 1) the contract with Charleston Stage did not follow proper procurement procedures; and 2) the funds were used for “general school enrichment activities rather than their intended purpose of COVID</w:t>
+      </w:r>
+      <w:r>
+        <w:noBreakHyphen/>
+      </w:r>
+      <w:r>
+        <w:t xml:space="preserve">19 recovery.” (</w:t>
       </w:r>
       <w:r>
         <w:rPr>
@@ -878,7 +1317,7 @@
         <w:t xml:space="preserve">Id.</w:t>
       </w:r>
       <w:r>
-        <w:t xml:space="preserve">, ¶ 41) The Amended Complaint does not tie the allegations related to the D23SP project to the submission of a claim, that was false or fraudulent, and that resulted in the government’s payment of money to the District.</w:t>
+        <w:t xml:space="preserve">, ¶ 41) The Amended Complaint does not tie the allegations related to the D23SP project to the submission of a claim, that was false or fraudulent, and that resulted in the government’s payment of money to the District.</w:t>
       </w:r>
     </w:p>
     <w:p>
@@ -896,7 +1335,7 @@
         <w:t xml:space="preserve">Id.</w:t>
       </w:r>
       <w:r>
-        <w:t xml:space="preserve">, ¶ 46) It appears that Plaintiff’s contention with regard to this project is the District’s payment of an “unusually high salary of $200,000” to Barbara Dilligard, an independent contractor, for grant writing and related consulting services. (</w:t>
+        <w:t xml:space="preserve">, ¶ 46) It appears that Plaintiff’s contention with regard to this project is the District’s payment of an “unusually high salary of $200,000” to Barbara Dilligard, an independent contractor, for grant writing and related consulting services. (</w:t>
       </w:r>
       <w:r>
         <w:rPr>
@@ -916,7 +1355,13 @@
         <w:t xml:space="preserve">Id.</w:t>
       </w:r>
       <w:r>
-        <w:t xml:space="preserve">, ¶¶ 46-47) The Amended Complaint does not tie the allegations related to the D20PCP project to the submission of a claim, that was false or fraudulent, and that resulted in the government’s payment of money to the District.</w:t>
+        <w:t xml:space="preserve">, ¶¶ 46</w:t>
+      </w:r>
+      <w:r>
+        <w:noBreakHyphen/>
+      </w:r>
+      <w:r>
+        <w:t xml:space="preserve">47) The Amended Complaint does not tie the allegations related to the D20PCP project to the submission of a claim, that was false or fraudulent, and that resulted in the government’s payment of money to the District.</w:t>
       </w:r>
     </w:p>
     <w:p>
@@ -934,7 +1379,7 @@
         <w:t xml:space="preserve">Id.</w:t>
       </w:r>
       <w:r>
-        <w:t xml:space="preserve">, ¶ 49) Plaintiff alleges the D4NC project did not comply with federal procurement protocol and was an improper use of ESSER funds. (</w:t>
+        <w:t xml:space="preserve">, ¶ 49) Plaintiff alleges the D4NC project did not comply with federal procurement protocol and was an improper use of ESSER funds. (</w:t>
       </w:r>
       <w:r>
         <w:rPr>
@@ -979,7 +1424,7 @@
         <w:t xml:space="preserve">Id.</w:t>
       </w:r>
       <w:r>
-        <w:t xml:space="preserve">, ¶ 50)</w:t>
+        <w:t xml:space="preserve">, ¶ 50)</w:t>
       </w:r>
     </w:p>
     <w:p>
@@ -1000,7 +1445,7 @@
         <w:t xml:space="preserve">United States v. Savannah River Nuclear Sols.</w:t>
       </w:r>
       <w:r>
-        <w:t xml:space="preserve">, LLC, 2016 WL 7104823, at *9 (D.S.C. Dec. 6, 2016) (quoting</w:t>
+        <w:t xml:space="preserve">, LLC, 2016 WL 7104823, at *9 (D.S.C. Dec. 6, 2016) (quoting</w:t>
       </w:r>
       <w:r>
         <w:t xml:space="preserve"> </w:t>
@@ -1053,16 +1498,23 @@
     <w:p>
       <w:pPr>
         <w:pStyle w:val="Heading2"/>
-      </w:pPr>
-      <w:bookmarkStart w:id="16" w:name="_conclusion"/>
-      <w:r>
+        <w:keepNext/>
+        <w:keepLines/>
+        <w:spacing w:before="288" w:after="216" w:line="276" w:lineRule="exact"/>
+        <w:ind w:left="0" w:firstLine="0"/>
+        <w:jc w:val="center"/>
+      </w:pPr>
+      <w:r>
+        <w:rPr>
+          <w:b/>
+          <w:bCs/>
+        </w:rPr>
         <w:t xml:space="preserve">CONCLUSION</w:t>
       </w:r>
-      <w:bookmarkEnd w:id="16"/>
     </w:p>
     <w:p>
       <w:pPr>
-        <w:pStyle w:val="FirstParagraph"/>
+        <w:pStyle w:val="BodyText"/>
       </w:pPr>
       <w:r>
         <w:t xml:space="preserve">For the foregoing reasons, the Charleston County School District asks this Court to grant its Motion to Dismiss and to dismiss the Amended Complaint in its entirety and with prejudice.</w:t>
@@ -1071,20 +1523,14 @@
     <w:tbl>
       <w:tblPr>
         <w:tblW w:w="9360" w:type="dxa"/>
-        <w:tblBorders>
-          <w:top w:val="nil"/>
-          <w:left w:val="nil"/>
-          <w:bottom w:val="nil"/>
-          <w:right w:val="nil"/>
-          <w:insideH w:val="nil"/>
-          <w:insideV w:val="nil"/>
-        </w:tblBorders>
         <w:tblLayout w:type="fixed"/>
         <w:tblCellMar>
+          <w:top w:w="0" w:type="dxa"/>
           <w:left w:w="0" w:type="dxa"/>
+          <w:bottom w:w="0" w:type="dxa"/>
           <w:right w:w="0" w:type="dxa"/>
         </w:tblCellMar>
-        <w:tblLook w:val="0000" w:firstRow="0" w:lastRow="0" w:firstColumn="0" w:lastColumn="0" w:noHBand="1" w:noVBand="1"/>
+        <w:tblLook w:val="0000" w:firstRow="0" w:lastRow="0" w:firstColumn="0" w:lastColumn="0" w:noHBand="0" w:noVBand="0"/>
       </w:tblPr>
       <w:tblGrid>
         <w:gridCol w:w="4752"/>
@@ -1100,8 +1546,9 @@
           </w:tcPr>
           <w:p>
             <w:pPr>
-              <w:pStyle w:val="SignatureText"/>
-              <w:spacing w:before="360" w:after="0"/>
+              <w:spacing w:before="360" w:after="0" w:line="276" w:lineRule="exact"/>
+              <w:ind w:left="0" w:firstLine="0"/>
+              <w:jc w:val="left"/>
             </w:pPr>
             <w:r>
               <w:t xml:space="preserve">Charleston,</w:t>
@@ -1115,8 +1562,9 @@
           </w:p>
           <w:p>
             <w:pPr>
-              <w:pStyle w:val="SignatureText"/>
-              <w:spacing w:before="0" w:after="0"/>
+              <w:spacing w:before="0" w:after="0" w:line="276" w:lineRule="exact"/>
+              <w:ind w:left="0" w:firstLine="0"/>
+              <w:jc w:val="left"/>
             </w:pPr>
             <w:r>
               <w:t xml:space="preserve">August</w:t>
@@ -1141,8 +1589,9 @@
           </w:tcPr>
           <w:p>
             <w:pPr>
-              <w:pStyle w:val="SignatureText"/>
-              <w:spacing w:before="360" w:after="0"/>
+              <w:spacing w:before="360" w:after="0" w:line="276" w:lineRule="exact"/>
+              <w:ind w:left="0" w:firstLine="0"/>
+              <w:jc w:val="left"/>
             </w:pPr>
             <w:r>
               <w:t xml:space="preserve">SAXTON</w:t>
@@ -1162,56 +1611,98 @@
           </w:p>
           <w:p>
             <w:pPr>
-              <w:pStyle w:val="SignatureText"/>
-              <w:spacing w:before="0" w:after="0"/>
+              <w:spacing w:before="276" w:after="0" w:line="276" w:lineRule="exact"/>
+              <w:ind w:left="0" w:firstLine="0"/>
+              <w:jc w:val="left"/>
             </w:pPr>
+            <w:r>
+              <w:t xml:space="preserve">By:</w:t>
+            </w:r>
+            <w:r>
+              <w:t xml:space="preserve"> </w:t>
+            </w:r>
+            <w:r>
+              <w:t xml:space="preserve">/​s/</w:t>
+            </w:r>
+            <w:r>
+              <w:t xml:space="preserve"> </w:t>
+            </w:r>
+            <w:r>
+              <w:t xml:space="preserve">Elizabeth</w:t>
+            </w:r>
+            <w:r>
+              <w:t xml:space="preserve"> </w:t>
+            </w:r>
+            <w:r>
+              <w:t xml:space="preserve">Palmer</w:t>
+            </w:r>
           </w:p>
           <w:p>
             <w:pPr>
-              <w:pStyle w:val="SignatureText"/>
-              <w:spacing w:before="0" w:after="0"/>
+              <w:spacing w:before="0" w:after="0" w:line="276" w:lineRule="exact"/>
+              <w:ind w:left="0" w:firstLine="0"/>
+              <w:jc w:val="left"/>
             </w:pPr>
             <w:r>
-              <w:t xml:space="preserve">By:</w:t>
-            </w:r>
-            <w:r>
-              <w:t xml:space="preserve"> </w:t>
-            </w:r>
-            <w:r>
-              <w:t xml:space="preserve">/s/</w:t>
-            </w:r>
-            <w:r>
-              <w:t xml:space="preserve"> </w:t>
-            </w:r>
-            <w:r>
-              <w:t xml:space="preserve">Elizabeth</w:t>
-            </w:r>
-            <w:r>
-              <w:t xml:space="preserve"> </w:t>
-            </w:r>
-            <w:r>
-              <w:t xml:space="preserve">Palmer</w:t>
+              <w:t xml:space="preserve">Alice</w:t>
+            </w:r>
+            <w:r>
+              <w:t xml:space="preserve"> </w:t>
+            </w:r>
+            <w:r>
+              <w:t xml:space="preserve">F.</w:t>
+            </w:r>
+            <w:r>
+              <w:t xml:space="preserve"> </w:t>
+            </w:r>
+            <w:r>
+              <w:t xml:space="preserve">Paylor,</w:t>
+            </w:r>
+            <w:r>
+              <w:t xml:space="preserve"> </w:t>
+            </w:r>
+            <w:r>
+              <w:t xml:space="preserve">District</w:t>
+            </w:r>
+            <w:r>
+              <w:t xml:space="preserve"> </w:t>
+            </w:r>
+            <w:r>
+              <w:t xml:space="preserve">Court</w:t>
+            </w:r>
+            <w:r>
+              <w:t xml:space="preserve"> </w:t>
+            </w:r>
+            <w:r>
+              <w:t xml:space="preserve">ID</w:t>
+            </w:r>
+            <w:r>
+              <w:t xml:space="preserve"> </w:t>
+            </w:r>
+            <w:r>
+              <w:t xml:space="preserve">#4017</w:t>
             </w:r>
           </w:p>
           <w:p>
             <w:pPr>
-              <w:pStyle w:val="SignatureText"/>
-              <w:spacing w:before="0" w:after="0"/>
+              <w:spacing w:before="0" w:after="0" w:line="276" w:lineRule="exact"/>
+              <w:ind w:left="0" w:firstLine="0"/>
+              <w:jc w:val="left"/>
             </w:pPr>
             <w:r>
-              <w:t xml:space="preserve">Alice</w:t>
-            </w:r>
-            <w:r>
-              <w:t xml:space="preserve"> </w:t>
-            </w:r>
-            <w:r>
-              <w:t xml:space="preserve">F.</w:t>
-            </w:r>
-            <w:r>
-              <w:t xml:space="preserve"> </w:t>
-            </w:r>
-            <w:r>
-              <w:t xml:space="preserve">Paylor,</w:t>
+              <w:t xml:space="preserve">Isabelle</w:t>
+            </w:r>
+            <w:r>
+              <w:t xml:space="preserve"> </w:t>
+            </w:r>
+            <w:r>
+              <w:t xml:space="preserve">S.</w:t>
+            </w:r>
+            <w:r>
+              <w:t xml:space="preserve"> </w:t>
+            </w:r>
+            <w:r>
+              <w:t xml:space="preserve">Young,</w:t>
             </w:r>
             <w:r>
               <w:t xml:space="preserve"> </w:t>
@@ -1235,28 +1726,23 @@
               <w:t xml:space="preserve"> </w:t>
             </w:r>
             <w:r>
-              <w:t xml:space="preserve">#4017</w:t>
+              <w:t xml:space="preserve">#14209</w:t>
             </w:r>
           </w:p>
           <w:p>
             <w:pPr>
-              <w:pStyle w:val="SignatureText"/>
-              <w:spacing w:before="0" w:after="0"/>
+              <w:spacing w:before="0" w:after="0" w:line="276" w:lineRule="exact"/>
+              <w:ind w:left="0" w:firstLine="0"/>
+              <w:jc w:val="left"/>
             </w:pPr>
             <w:r>
-              <w:t xml:space="preserve">Isabelle</w:t>
-            </w:r>
-            <w:r>
-              <w:t xml:space="preserve"> </w:t>
-            </w:r>
-            <w:r>
-              <w:t xml:space="preserve">S.</w:t>
-            </w:r>
-            <w:r>
-              <w:t xml:space="preserve"> </w:t>
-            </w:r>
-            <w:r>
-              <w:t xml:space="preserve">Young,</w:t>
+              <w:t xml:space="preserve">Elizabeth</w:t>
+            </w:r>
+            <w:r>
+              <w:t xml:space="preserve"> </w:t>
+            </w:r>
+            <w:r>
+              <w:t xml:space="preserve">Palmer,</w:t>
             </w:r>
             <w:r>
               <w:t xml:space="preserve"> </w:t>
@@ -1280,181 +1766,152 @@
               <w:t xml:space="preserve"> </w:t>
             </w:r>
             <w:r>
-              <w:t xml:space="preserve">#14209</w:t>
+              <w:t xml:space="preserve">#</w:t>
+            </w:r>
+            <w:r>
+              <w:t xml:space="preserve"> </w:t>
+            </w:r>
+            <w:r>
+              <w:t xml:space="preserve">9716</w:t>
             </w:r>
           </w:p>
           <w:p>
             <w:pPr>
-              <w:pStyle w:val="SignatureText"/>
-              <w:spacing w:before="0" w:after="0"/>
+              <w:spacing w:before="144" w:after="0" w:line="276" w:lineRule="exact"/>
+              <w:ind w:left="0" w:firstLine="0"/>
+              <w:jc w:val="left"/>
             </w:pPr>
             <w:r>
-              <w:t xml:space="preserve">Elizabeth</w:t>
-            </w:r>
-            <w:r>
-              <w:t xml:space="preserve"> </w:t>
-            </w:r>
-            <w:r>
-              <w:t xml:space="preserve">Palmer,</w:t>
-            </w:r>
-            <w:r>
-              <w:t xml:space="preserve"> </w:t>
-            </w:r>
-            <w:r>
-              <w:t xml:space="preserve">District</w:t>
-            </w:r>
-            <w:r>
-              <w:t xml:space="preserve"> </w:t>
-            </w:r>
-            <w:r>
-              <w:t xml:space="preserve">Court</w:t>
-            </w:r>
-            <w:r>
-              <w:t xml:space="preserve"> </w:t>
-            </w:r>
-            <w:r>
-              <w:t xml:space="preserve">ID</w:t>
-            </w:r>
-            <w:r>
-              <w:t xml:space="preserve"> </w:t>
-            </w:r>
-            <w:r>
-              <w:t xml:space="preserve">#</w:t>
-            </w:r>
-            <w:r>
-              <w:t xml:space="preserve"> </w:t>
-            </w:r>
-            <w:r>
-              <w:t xml:space="preserve">9716</w:t>
+              <w:t xml:space="preserve">Saxton</w:t>
+            </w:r>
+            <w:r>
+              <w:t xml:space="preserve"> </w:t>
+            </w:r>
+            <w:r>
+              <w:t xml:space="preserve">&amp;</w:t>
+            </w:r>
+            <w:r>
+              <w:t xml:space="preserve"> </w:t>
+            </w:r>
+            <w:r>
+              <w:t xml:space="preserve">Stump,</w:t>
+            </w:r>
+            <w:r>
+              <w:t xml:space="preserve"> </w:t>
+            </w:r>
+            <w:r>
+              <w:t xml:space="preserve">LLC</w:t>
             </w:r>
           </w:p>
           <w:p>
             <w:pPr>
-              <w:pStyle w:val="SignatureText"/>
-              <w:spacing w:before="144" w:after="0"/>
+              <w:spacing w:before="0" w:after="0" w:line="276" w:lineRule="exact"/>
+              <w:ind w:left="0" w:firstLine="0"/>
+              <w:jc w:val="left"/>
             </w:pPr>
             <w:r>
-              <w:t xml:space="preserve">Saxton</w:t>
-            </w:r>
-            <w:r>
-              <w:t xml:space="preserve"> </w:t>
-            </w:r>
-            <w:r>
-              <w:t xml:space="preserve">&amp;</w:t>
-            </w:r>
-            <w:r>
-              <w:t xml:space="preserve"> </w:t>
-            </w:r>
-            <w:r>
-              <w:t xml:space="preserve">Stump,</w:t>
-            </w:r>
-            <w:r>
-              <w:t xml:space="preserve"> </w:t>
-            </w:r>
-            <w:r>
-              <w:t xml:space="preserve">LLC</w:t>
+              <w:t xml:space="preserve">151</w:t>
+            </w:r>
+            <w:r>
+              <w:t xml:space="preserve"> </w:t>
+            </w:r>
+            <w:r>
+              <w:t xml:space="preserve">Meeting</w:t>
+            </w:r>
+            <w:r>
+              <w:t xml:space="preserve"> </w:t>
+            </w:r>
+            <w:r>
+              <w:t xml:space="preserve">Street,</w:t>
+            </w:r>
+            <w:r>
+              <w:t xml:space="preserve"> </w:t>
+            </w:r>
+            <w:r>
+              <w:t xml:space="preserve">Suite</w:t>
+            </w:r>
+            <w:r>
+              <w:t xml:space="preserve"> </w:t>
+            </w:r>
+            <w:r>
+              <w:t xml:space="preserve">400</w:t>
             </w:r>
           </w:p>
           <w:p>
             <w:pPr>
-              <w:pStyle w:val="SignatureText"/>
-              <w:spacing w:before="0" w:after="0"/>
+              <w:spacing w:before="0" w:after="0" w:line="276" w:lineRule="exact"/>
+              <w:ind w:left="0" w:firstLine="0"/>
+              <w:jc w:val="left"/>
             </w:pPr>
             <w:r>
-              <w:t xml:space="preserve">151</w:t>
-            </w:r>
-            <w:r>
-              <w:t xml:space="preserve"> </w:t>
-            </w:r>
-            <w:r>
-              <w:t xml:space="preserve">Meeting</w:t>
-            </w:r>
-            <w:r>
-              <w:t xml:space="preserve"> </w:t>
-            </w:r>
-            <w:r>
-              <w:t xml:space="preserve">Street,</w:t>
-            </w:r>
-            <w:r>
-              <w:t xml:space="preserve"> </w:t>
-            </w:r>
-            <w:r>
-              <w:t xml:space="preserve">Suite</w:t>
-            </w:r>
-            <w:r>
-              <w:t xml:space="preserve"> </w:t>
-            </w:r>
-            <w:r>
-              <w:t xml:space="preserve">400</w:t>
+              <w:t xml:space="preserve">Charleston,</w:t>
+            </w:r>
+            <w:r>
+              <w:t xml:space="preserve"> </w:t>
+            </w:r>
+            <w:r>
+              <w:t xml:space="preserve">SC</w:t>
+            </w:r>
+            <w:r>
+              <w:t xml:space="preserve"> </w:t>
+            </w:r>
+            <w:r>
+              <w:t xml:space="preserve">29401</w:t>
             </w:r>
           </w:p>
           <w:p>
             <w:pPr>
-              <w:pStyle w:val="SignatureText"/>
-              <w:spacing w:before="0" w:after="0"/>
+              <w:spacing w:before="0" w:after="0" w:line="276" w:lineRule="exact"/>
+              <w:ind w:left="0" w:firstLine="0"/>
+              <w:jc w:val="left"/>
             </w:pPr>
             <w:r>
-              <w:t xml:space="preserve">Charleston,</w:t>
-            </w:r>
-            <w:r>
-              <w:t xml:space="preserve"> </w:t>
-            </w:r>
-            <w:r>
-              <w:t xml:space="preserve">SC</w:t>
-            </w:r>
-            <w:r>
-              <w:t xml:space="preserve"> </w:t>
-            </w:r>
-            <w:r>
-              <w:t xml:space="preserve">29401</w:t>
+              <w:t xml:space="preserve">(843)</w:t>
+            </w:r>
+            <w:r>
+              <w:t xml:space="preserve"> </w:t>
+            </w:r>
+            <w:r>
+              <w:t xml:space="preserve">414</w:t>
+              <w:noBreakHyphen/>
+              <w:t xml:space="preserve">5080</w:t>
             </w:r>
           </w:p>
           <w:p>
             <w:pPr>
-              <w:pStyle w:val="SignatureText"/>
-              <w:spacing w:before="0" w:after="0"/>
+              <w:spacing w:before="0" w:after="0" w:line="276" w:lineRule="exact"/>
+              <w:ind w:left="0" w:firstLine="0"/>
+              <w:jc w:val="left"/>
             </w:pPr>
             <w:r>
-              <w:t xml:space="preserve">(843)</w:t>
-            </w:r>
-            <w:r>
-              <w:t xml:space="preserve"> </w:t>
-            </w:r>
-            <w:r>
-              <w:t xml:space="preserve">414-5080</w:t>
+              <w:t xml:space="preserve">afp@saxtonstump.com</w:t>
             </w:r>
           </w:p>
           <w:p>
             <w:pPr>
-              <w:pStyle w:val="SignatureText"/>
-              <w:spacing w:before="0" w:after="0"/>
+              <w:spacing w:before="0" w:after="0" w:line="276" w:lineRule="exact"/>
+              <w:ind w:left="0" w:firstLine="0"/>
+              <w:jc w:val="left"/>
             </w:pPr>
             <w:r>
-              <w:t xml:space="preserve">afp@saxtonstump.com</w:t>
+              <w:t xml:space="preserve">iyoung@saxtonstump.com</w:t>
             </w:r>
           </w:p>
           <w:p>
             <w:pPr>
-              <w:pStyle w:val="SignatureText"/>
-              <w:spacing w:before="0" w:after="0"/>
+              <w:spacing w:before="0" w:after="0" w:line="276" w:lineRule="exact"/>
+              <w:ind w:left="0" w:firstLine="0"/>
+              <w:jc w:val="left"/>
             </w:pPr>
             <w:r>
-              <w:t xml:space="preserve">iyoung@saxtonstump.com</w:t>
+              <w:t xml:space="preserve">ep@saxtonstump.com</w:t>
             </w:r>
           </w:p>
           <w:p>
             <w:pPr>
-              <w:pStyle w:val="SignatureText"/>
-              <w:spacing w:before="0" w:after="0"/>
-            </w:pPr>
-            <w:r>
-              <w:t xml:space="preserve">ep@saxtonstump.com</w:t>
-            </w:r>
-          </w:p>
-          <w:p>
-            <w:pPr>
-              <w:pStyle w:val="SignatureText"/>
-              <w:spacing w:before="0" w:after="0"/>
+              <w:spacing w:before="0" w:after="0" w:line="276" w:lineRule="exact"/>
+              <w:ind w:left="0" w:firstLine="0"/>
+              <w:jc w:val="left"/>
             </w:pPr>
             <w:r>
               <w:t xml:space="preserve">ATTORNEYS</w:t>
@@ -1477,12 +1934,8 @@
     </w:tbl>
     <w:sectPr>
       <w:footerReference w:type="default" r:id="rIdFooter1"/>
-      <w:footnotePr>
-        <w:numRestart w:val="eachSect"/>
-      </w:footnotePr>
       <w:pgSz w:w="12240" w:h="15840"/>
       <w:pgMar w:top="1440" w:right="1440" w:bottom="1440" w:left="1440" w:header="720" w:footer="720" w:gutter="0"/>
-      <w:cols w:space="720"/>
     </w:sectPr>
   </w:body>
 </w:document>
@@ -1496,6 +1949,7 @@
 <w:ftr xmlns:w="http://schemas.openxmlformats.org/wordprocessingml/2006/main" xmlns:r="http://schemas.openxmlformats.org/officeDocument/2006/relationships">
   <w:p>
     <w:pPr>
+      <w:spacing w:before="0" w:after="0" w:line="276" w:lineRule="exact"/>
       <w:jc w:val="center"/>
     </w:pPr>
     <w:r>
@@ -1533,7 +1987,7 @@
       </w:r>
     </w:p>
   </w:footnote>
-  <w:footnote w:id="10">
+  <w:footnote w:id="9">
     <w:p>
       <w:pPr>
         <w:pStyle w:val="FootnoteText"/>
@@ -1548,7 +2002,7 @@
         <w:t xml:space="preserve"> </w:t>
       </w:r>
       <w:r>
-        <w:t xml:space="preserve">On December 17, 2025, the United States declined to intervene in this matter. ECF No. 10.</w:t>
+        <w:t xml:space="preserve">On December 17, 2025, the United States declined to intervene in this matter. ECF No. 10.</w:t>
       </w:r>
     </w:p>
   </w:footnote>
@@ -1644,15 +2098,16 @@
   <w:docDefaults>
     <w:rPrDefault>
       <w:rPr>
-        <w:rFonts w:ascii="Times New Roman" w:eastAsia="Times New Roman" w:hAnsi="Times New Roman" w:cs="Times New Roman"/>
+        <w:rFonts w:ascii="Times New Roman" w:hAnsi="Times New Roman" w:eastAsia="Times New Roman" w:cs="Times New Roman"/>
         <w:sz w:val="24"/>
         <w:szCs w:val="24"/>
-        <w:lang w:val="en-US" w:eastAsia="en-US" w:bidi="ar-SA"/>
+        <w:lang w:val="en-US" w:eastAsia="zh-CN" w:bidi="ar-SA"/>
       </w:rPr>
     </w:rPrDefault>
     <w:pPrDefault>
       <w:pPr>
-        <w:spacing w:after="0" w:line="240" w:lineRule="auto"/>
+        <w:widowControl/>
+        <w:spacing w:after="0"/>
       </w:pPr>
     </w:pPrDefault>
   </w:docDefaults>
@@ -1660,9 +2115,6 @@
   <w:style w:type="paragraph" w:default="1" w:styleId="Normal">
     <w:name w:val="Normal"/>
     <w:qFormat/>
-    <w:pPr>
-      <w:widowControl/>
-    </w:pPr>
   </w:style>
   <w:style w:type="paragraph" w:styleId="BodyText">
     <w:name w:val="Body Text"/>
@@ -1670,7 +2122,7 @@
     <w:link w:val="BodyTextChar"/>
     <w:qFormat/>
     <w:pPr>
-      <w:spacing w:before="0" w:after="0" w:line="480" w:lineRule="auto"/>
+      <w:spacing w:before="0" w:after="0" w:line="552" w:lineRule="exact"/>
       <w:ind w:firstLine="720"/>
     </w:pPr>
   </w:style>
@@ -1679,17 +2131,13 @@
     <w:basedOn w:val="BodyText"/>
     <w:next w:val="BodyText"/>
     <w:qFormat/>
-    <w:pPr>
-      <w:spacing w:before="0" w:after="0" w:line="480" w:lineRule="auto"/>
-      <w:ind w:firstLine="720"/>
-    </w:pPr>
   </w:style>
   <w:style w:type="paragraph" w:customStyle="1" w:styleId="Compact">
     <w:name w:val="Compact"/>
-    <w:basedOn w:val="Normal"/>
+    <w:basedOn w:val="BodyText"/>
     <w:qFormat/>
     <w:pPr>
-      <w:spacing w:before="0" w:after="0" w:line="240" w:lineRule="auto"/>
+      <w:spacing w:before="36" w:after="36"/>
     </w:pPr>
   </w:style>
   <w:style w:type="paragraph" w:styleId="Title">
@@ -1832,16 +2280,17 @@
     <w:link w:val="Heading1Char"/>
     <w:uiPriority w:val="9"/>
     <w:qFormat/>
+    <w:rsid w:val="00A10FD9"/>
     <w:pPr>
       <w:keepNext/>
       <w:keepLines/>
-      <w:spacing w:before="288" w:after="216" w:line="240" w:lineRule="auto"/>
+      <w:spacing w:before="240" w:after="120" w:line="276" w:lineRule="exact"/>
       <w:ind w:firstLine="0"/>
       <w:jc w:val="center"/>
       <w:outlineLvl w:val="0"/>
     </w:pPr>
     <w:rPr>
-      <w:rFonts w:ascii="Times New Roman" w:eastAsia="Times New Roman" w:hAnsi="Times New Roman" w:cs="Times New Roman"/>
+      <w:rFonts w:ascii="Times New Roman" w:hAnsi="Times New Roman" w:eastAsia="Times New Roman" w:cs="Times New Roman"/>
       <w:b/>
       <w:bCs/>
       <w:caps/>
@@ -1856,21 +2305,21 @@
     <w:next w:val="BodyText"/>
     <w:link w:val="Heading2Char"/>
     <w:uiPriority w:val="9"/>
+    <w:semiHidden/>
     <w:unhideWhenUsed/>
     <w:qFormat/>
+    <w:rsid w:val="00A10FD9"/>
     <w:pPr>
       <w:keepNext/>
       <w:keepLines/>
-      <w:spacing w:before="288" w:after="216" w:line="240" w:lineRule="auto"/>
+      <w:spacing w:before="240" w:after="120" w:line="276" w:lineRule="exact"/>
       <w:ind w:firstLine="0"/>
-      <w:jc w:val="center"/>
       <w:outlineLvl w:val="1"/>
     </w:pPr>
     <w:rPr>
-      <w:rFonts w:ascii="Times New Roman" w:eastAsia="Times New Roman" w:hAnsi="Times New Roman" w:cs="Times New Roman"/>
+      <w:rFonts w:ascii="Times New Roman" w:hAnsi="Times New Roman" w:eastAsia="Times New Roman" w:cs="Times New Roman"/>
       <w:b/>
       <w:bCs/>
-      <w:caps/>
       <w:color w:val="000000"/>
       <w:sz w:val="24"/>
       <w:szCs w:val="24"/>
@@ -1882,17 +2331,19 @@
     <w:next w:val="BodyText"/>
     <w:link w:val="Heading3Char"/>
     <w:uiPriority w:val="9"/>
+    <w:semiHidden/>
     <w:unhideWhenUsed/>
     <w:qFormat/>
+    <w:rsid w:val="00A10FD9"/>
     <w:pPr>
       <w:keepNext/>
       <w:keepLines/>
-      <w:spacing w:before="240" w:after="216" w:line="240" w:lineRule="auto"/>
+      <w:spacing w:before="240" w:after="120" w:line="276" w:lineRule="exact"/>
       <w:ind w:firstLine="0"/>
       <w:outlineLvl w:val="2"/>
     </w:pPr>
     <w:rPr>
-      <w:rFonts w:ascii="Times New Roman" w:eastAsia="Times New Roman" w:hAnsi="Times New Roman" w:cs="Times New Roman"/>
+      <w:rFonts w:ascii="Times New Roman" w:hAnsi="Times New Roman" w:eastAsia="Times New Roman" w:cs="Times New Roman"/>
       <w:b/>
       <w:bCs/>
       <w:color w:val="000000"/>
@@ -1913,14 +2364,18 @@
     <w:pPr>
       <w:keepNext/>
       <w:keepLines/>
-      <w:spacing w:before="80" w:after="40"/>
+      <w:spacing w:before="240" w:after="120" w:line="276" w:lineRule="exact"/>
+      <w:ind w:firstLine="0"/>
       <w:outlineLvl w:val="3"/>
     </w:pPr>
     <w:rPr>
-      <w:rFonts w:eastAsiaTheme="majorEastAsia" w:cstheme="majorBidi"/>
+      <w:rFonts w:ascii="Times New Roman" w:hAnsi="Times New Roman" w:eastAsia="Times New Roman" w:cs="Times New Roman"/>
+      <w:b/>
+      <w:bCs/>
       <w:i/>
-      <w:iCs/>
-      <w:color w:val="0F4761" w:themeColor="accent1" w:themeShade="BF"/>
+      <w:color w:val="000000"/>
+      <w:sz w:val="24"/>
+      <w:szCs w:val="24"/>
     </w:rPr>
   </w:style>
   <w:style w:type="paragraph" w:styleId="Heading5">
@@ -1936,12 +2391,18 @@
     <w:pPr>
       <w:keepNext/>
       <w:keepLines/>
-      <w:spacing w:before="80" w:after="40"/>
+      <w:spacing w:before="240" w:after="120" w:line="276" w:lineRule="exact"/>
+      <w:ind w:firstLine="0"/>
       <w:outlineLvl w:val="4"/>
     </w:pPr>
     <w:rPr>
-      <w:rFonts w:eastAsiaTheme="majorEastAsia" w:cstheme="majorBidi"/>
-      <w:color w:val="0F4761" w:themeColor="accent1" w:themeShade="BF"/>
+      <w:rFonts w:ascii="Times New Roman" w:hAnsi="Times New Roman" w:eastAsia="Times New Roman" w:cs="Times New Roman"/>
+      <w:b/>
+      <w:bCs/>
+      <w:i/>
+      <w:color w:val="000000"/>
+      <w:sz w:val="24"/>
+      <w:szCs w:val="24"/>
     </w:rPr>
   </w:style>
   <w:style w:type="paragraph" w:styleId="Heading6">
@@ -2151,31 +2612,37 @@
       <w:color w:val="272727" w:themeColor="text1" w:themeTint="D8"/>
     </w:rPr>
   </w:style>
+  <w:style w:type="paragraph" w:customStyle="1" w:styleId="ListItem">
+    <w:name w:val="List Item"/>
+    <w:basedOn w:val="BodyText"/>
+    <w:qFormat/>
+    <w:pPr>
+      <w:spacing w:before="0" w:after="0" w:line="552" w:lineRule="exact"/>
+      <w:ind w:left="720" w:hanging="720"/>
+    </w:pPr>
+  </w:style>
   <w:style w:type="paragraph" w:styleId="BlockText">
     <w:name w:val="Block Text"/>
-    <w:basedOn w:val="Normal"/>
+    <w:basedOn w:val="BodyText"/>
     <w:next w:val="BodyText"/>
     <w:uiPriority w:val="9"/>
     <w:unhideWhenUsed/>
     <w:qFormat/>
     <w:pPr>
-      <w:spacing w:before="0" w:after="240" w:line="240" w:lineRule="auto"/>
+      <w:spacing w:before="240" w:after="240" w:line="276" w:lineRule="exact"/>
       <w:ind w:firstLine="0" w:left="720" w:right="720"/>
     </w:pPr>
-    <w:rPr>
-      <w:sz w:val="24"/>
-      <w:szCs w:val="24"/>
-    </w:rPr>
   </w:style>
   <w:style w:type="paragraph" w:styleId="FootnoteText">
-    <w:name w:val="footnote text"/>
+    <w:name w:val="Footnote Text"/>
     <w:basedOn w:val="Normal"/>
+    <w:next w:val="FootnoteText"/>
     <w:uiPriority w:val="9"/>
     <w:unhideWhenUsed/>
     <w:qFormat/>
     <w:pPr>
-      <w:spacing w:before="0" w:after="120" w:line="240" w:lineRule="auto"/>
-      <w:ind w:firstLine="0"/>
+      <w:keepLines/>
+      <w:spacing w:before="0" w:after="120" w:line="276" w:lineRule="exact"/>
     </w:pPr>
     <w:rPr>
       <w:sz w:val="24"/>
@@ -2190,8 +2657,8 @@
     <w:unhideWhenUsed/>
     <w:qFormat/>
     <w:pPr>
-      <w:spacing w:before="100" w:after="100"/>
-      <w:ind w:firstLine="0" w:left="480" w:right="480"/>
+      <w:spacing w:before="240" w:after="240"/>
+      <w:ind w:firstLine="0" w:left="720" w:right="720"/>
     </w:pPr>
   </w:style>
   <w:style w:type="character" w:default="1" w:styleId="DefaultParagraphFont">
@@ -2202,8 +2669,6 @@
   <w:style w:type="table" w:default="1" w:styleId="Table">
     <w:name w:val="Table"/>
     <w:basedOn w:val="TableNormal"/>
-    <w:semiHidden/>
-    <w:unhideWhenUsed/>
     <w:qFormat/>
     <w:tblPr>
       <w:tblInd w:w="0" w:type="dxa"/>
@@ -2215,13 +2680,6 @@
       </w:tblCellMar>
     </w:tblPr>
     <w:tblStylePr w:type="firstRow">
-      <w:tblPr>
-        <w:jc w:val="left"/>
-        <w:tblInd w:w="0" w:type="dxa"/>
-      </w:tblPr>
-      <w:trPr>
-        <w:jc w:val="left"/>
-      </w:trPr>
       <w:tcPr>
         <w:tcBorders>
           <w:bottom w:val="single"/>
@@ -2308,7 +2766,7 @@
     <w:name w:val="Hyperlink"/>
     <w:basedOn w:val="BodyTextChar"/>
     <w:rPr>
-      <w:color w:val="4F81BD" w:themeColor="accent1"/>
+      <w:color w:val="000000"/>
     </w:rPr>
   </w:style>
   <w:style w:type="paragraph" w:styleId="TOCHeading">
@@ -2329,64 +2787,12 @@
       <w:color w:val="365F91" w:themeColor="accent1" w:themeShade="BF"/>
     </w:rPr>
   </w:style>
-  <w:style w:type="paragraph" w:customStyle="1" w:styleId="CourtHeading">
-    <w:name w:val="Court Heading"/>
-    <w:basedOn w:val="Normal"/>
+  <w:style w:type="paragraph" w:customStyle="1" w:styleId="BodyTextNote">
+    <w:name w:val="Body Text Note"/>
+    <w:basedOn w:val="BodyText"/>
     <w:qFormat/>
     <w:pPr>
-      <w:keepNext/>
-      <w:spacing w:before="0" w:after="0" w:line="240" w:lineRule="auto"/>
-      <w:ind w:firstLine="0"/>
-      <w:jc w:val="center"/>
-    </w:pPr>
-    <w:rPr>
-      <w:b/>
-      <w:bCs/>
-      <w:caps/>
-    </w:rPr>
-  </w:style>
-  <w:style w:type="paragraph" w:customStyle="1" w:styleId="CourtHeadingLast">
-    <w:name w:val="Court Heading Last"/>
-    <w:basedOn w:val="CourtHeading"/>
-    <w:qFormat/>
-    <w:pPr>
-      <w:spacing w:before="0" w:after="360" w:line="240" w:lineRule="auto"/>
-    </w:pPr>
-  </w:style>
-  <w:style w:type="paragraph" w:customStyle="1" w:styleId="CaptionText">
-    <w:name w:val="Caption Text"/>
-    <w:basedOn w:val="Normal"/>
-    <w:qFormat/>
-    <w:pPr>
-      <w:spacing w:before="0" w:after="0" w:line="240" w:lineRule="auto"/>
-      <w:ind w:firstLine="0"/>
-    </w:pPr>
-  </w:style>
-  <w:style w:type="paragraph" w:customStyle="1" w:styleId="DocumentTitle">
-    <w:name w:val="Document Title"/>
-    <w:basedOn w:val="Normal"/>
-    <w:qFormat/>
-    <w:pPr>
-      <w:keepNext/>
-      <w:spacing w:before="360" w:after="165" w:line="240" w:lineRule="auto"/>
-      <w:ind w:firstLine="0"/>
-      <w:jc w:val="center"/>
-    </w:pPr>
-    <w:rPr>
-      <w:b/>
-      <w:bCs/>
-      <w:caps/>
-    </w:rPr>
-  </w:style>
-  <w:style w:type="paragraph" w:customStyle="1" w:styleId="SignatureText">
-    <w:name w:val="Signature Text"/>
-    <w:basedOn w:val="Normal"/>
-    <w:qFormat/>
-    <w:pPr>
-      <w:keepNext/>
-      <w:keepLines/>
-      <w:spacing w:before="0" w:after="0" w:line="240" w:lineRule="auto"/>
-      <w:ind w:firstLine="0"/>
+      <w:widowControl w:val="0"/>
     </w:pPr>
   </w:style>
   <w:style w:type="paragraph" w:customStyle="1" w:styleId="SourceCode">

</xml_diff>